<commit_message>
Update ChronoWiz user guides for clarity and visuals
Updated DOCX and PDF user guides to match recent HTML improvements: revised section headings and anchors, refreshed Table of Contents, added/removed embedded images, expanded instructions in the "File" section, and improved formatting for readability. No code changes were made.
</commit_message>
<xml_diff>
--- a/Doc/ChronoWiz_Users_Guide.docx
+++ b/Doc/ChronoWiz_Users_Guide.docx
@@ -4,61 +4,60 @@
   <w:body>
     <w:p>
       <w:pPr>
+        <w:pStyle w:val="Title"/>
         <w:jc w:val="center"/>
         <w:rPr>
-          <w:rFonts w:ascii="Verdana" w:hAnsi="Verdana"/>
-        </w:rPr>
-      </w:pPr>
-      <w:r>
-        <w:rPr>
-          <w:rFonts w:ascii="Verdana" w:hAnsi="Verdana"/>
-          <w:b/>
-          <w:sz w:val="96"/>
+          <w:rStyle w:val="IntenseReference"/>
+        </w:rPr>
+      </w:pPr>
+      <w:r>
+        <w:rPr>
+          <w:rStyle w:val="IntenseReference"/>
         </w:rPr>
         <w:t>ChronoWiz</w:t>
       </w:r>
     </w:p>
     <w:p>
       <w:pPr>
+        <w:pStyle w:val="Title"/>
         <w:jc w:val="center"/>
         <w:rPr>
-          <w:rFonts w:ascii="Verdana" w:hAnsi="Verdana"/>
-        </w:rPr>
-      </w:pPr>
-      <w:r>
-        <w:rPr>
-          <w:rFonts w:ascii="Verdana" w:hAnsi="Verdana"/>
-          <w:sz w:val="64"/>
+          <w:rStyle w:val="IntenseReference"/>
+        </w:rPr>
+      </w:pPr>
+      <w:r>
+        <w:rPr>
+          <w:rStyle w:val="IntenseReference"/>
         </w:rPr>
         <w:t>User's Guide</w:t>
       </w:r>
     </w:p>
     <w:p>
       <w:pPr>
+        <w:pStyle w:val="Title"/>
         <w:jc w:val="center"/>
         <w:rPr>
-          <w:rFonts w:ascii="Verdana" w:hAnsi="Verdana"/>
-        </w:rPr>
-      </w:pPr>
-      <w:r>
-        <w:rPr>
-          <w:rFonts w:ascii="Verdana" w:hAnsi="Verdana"/>
-          <w:sz w:val="48"/>
+          <w:rStyle w:val="IntenseReference"/>
+        </w:rPr>
+      </w:pPr>
+      <w:r>
+        <w:rPr>
+          <w:rStyle w:val="IntenseReference"/>
         </w:rPr>
         <w:t>Rev. 2.0</w:t>
       </w:r>
     </w:p>
     <w:p>
       <w:pPr>
+        <w:pStyle w:val="Title"/>
         <w:jc w:val="center"/>
         <w:rPr>
-          <w:rFonts w:ascii="Verdana" w:hAnsi="Verdana"/>
-        </w:rPr>
-      </w:pPr>
-      <w:r>
-        <w:rPr>
-          <w:rFonts w:ascii="Verdana" w:hAnsi="Verdana"/>
-          <w:sz w:val="48"/>
+          <w:rStyle w:val="IntenseReference"/>
+        </w:rPr>
+      </w:pPr>
+      <w:r>
+        <w:rPr>
+          <w:rStyle w:val="IntenseReference"/>
         </w:rPr>
         <w:t>Eigil Krogh Sorensen</w:t>
       </w:r>
@@ -119,7 +118,6 @@
               <w:tab w:val="right" w:leader="dot" w:pos="10790"/>
             </w:tabs>
             <w:rPr>
-              <w:rFonts w:ascii="Verdana" w:hAnsi="Verdana"/>
               <w:noProof/>
               <w:kern w:val="2"/>
               <w:sz w:val="24"/>
@@ -146,7 +144,7 @@
             </w:rPr>
             <w:fldChar w:fldCharType="separate"/>
           </w:r>
-          <w:hyperlink w:anchor="_Toc223632441" w:history="1">
+          <w:hyperlink w:anchor="_Toc223636902" w:history="1">
             <w:r>
               <w:rPr>
                 <w:rStyle w:val="Hyperlink"/>
@@ -157,7 +155,6 @@
             </w:r>
             <w:r>
               <w:rPr>
-                <w:rFonts w:ascii="Verdana" w:hAnsi="Verdana"/>
                 <w:noProof/>
                 <w:webHidden/>
               </w:rPr>
@@ -165,7 +162,6 @@
             </w:r>
             <w:r>
               <w:rPr>
-                <w:rFonts w:ascii="Verdana" w:hAnsi="Verdana"/>
                 <w:noProof/>
                 <w:webHidden/>
               </w:rPr>
@@ -173,22 +169,19 @@
             </w:r>
             <w:r>
               <w:rPr>
-                <w:rFonts w:ascii="Verdana" w:hAnsi="Verdana"/>
-                <w:noProof/>
-                <w:webHidden/>
-              </w:rPr>
-              <w:instrText xml:space="preserve"> PAGEREF _Toc223632441 \h </w:instrText>
-            </w:r>
-            <w:r>
-              <w:rPr>
-                <w:rFonts w:ascii="Verdana" w:hAnsi="Verdana"/>
-                <w:noProof/>
-                <w:webHidden/>
-              </w:rPr>
-            </w:r>
-            <w:r>
-              <w:rPr>
-                <w:rFonts w:ascii="Verdana" w:hAnsi="Verdana"/>
+                <w:noProof/>
+                <w:webHidden/>
+              </w:rPr>
+              <w:instrText xml:space="preserve"> PAGEREF _Toc223636902 \h </w:instrText>
+            </w:r>
+            <w:r>
+              <w:rPr>
+                <w:noProof/>
+                <w:webHidden/>
+              </w:rPr>
+            </w:r>
+            <w:r>
+              <w:rPr>
                 <w:noProof/>
                 <w:webHidden/>
               </w:rPr>
@@ -196,7 +189,6 @@
             </w:r>
             <w:r>
               <w:rPr>
-                <w:rFonts w:ascii="Verdana" w:hAnsi="Verdana"/>
                 <w:noProof/>
                 <w:webHidden/>
               </w:rPr>
@@ -204,7 +196,6 @@
             </w:r>
             <w:r>
               <w:rPr>
-                <w:rFonts w:ascii="Verdana" w:hAnsi="Verdana"/>
                 <w:noProof/>
                 <w:webHidden/>
               </w:rPr>
@@ -219,7 +210,6 @@
               <w:tab w:val="right" w:leader="dot" w:pos="10790"/>
             </w:tabs>
             <w:rPr>
-              <w:rFonts w:ascii="Verdana" w:hAnsi="Verdana"/>
               <w:noProof/>
               <w:kern w:val="2"/>
               <w:sz w:val="24"/>
@@ -228,28 +218,16 @@
               <w14:ligatures w14:val="standardContextual"/>
             </w:rPr>
           </w:pPr>
-          <w:hyperlink w:anchor="_Toc223632442" w:history="1">
+          <w:hyperlink w:anchor="_Toc223636903" w:history="1">
             <w:r>
               <w:rPr>
                 <w:rStyle w:val="Hyperlink"/>
-                <w:rFonts w:ascii="Verdana" w:hAnsi="Verdana"/>
-                <w:b/>
-                <w:bCs/>
-                <w:noProof/>
-              </w:rPr>
-              <w:t>Screen shots</w:t>
-            </w:r>
-            <w:r>
-              <w:rPr>
-                <w:rStyle w:val="Hyperlink"/>
-                <w:rFonts w:ascii="Verdana" w:hAnsi="Verdana"/>
-                <w:noProof/>
-              </w:rPr>
-              <w:t>.</w:t>
-            </w:r>
-            <w:r>
-              <w:rPr>
-                <w:rFonts w:ascii="Verdana" w:hAnsi="Verdana"/>
+                <w:noProof/>
+              </w:rPr>
+              <w:t>Screen shots.</w:t>
+            </w:r>
+            <w:r>
+              <w:rPr>
                 <w:noProof/>
                 <w:webHidden/>
               </w:rPr>
@@ -257,7 +235,6 @@
             </w:r>
             <w:r>
               <w:rPr>
-                <w:rFonts w:ascii="Verdana" w:hAnsi="Verdana"/>
                 <w:noProof/>
                 <w:webHidden/>
               </w:rPr>
@@ -265,22 +242,19 @@
             </w:r>
             <w:r>
               <w:rPr>
-                <w:rFonts w:ascii="Verdana" w:hAnsi="Verdana"/>
-                <w:noProof/>
-                <w:webHidden/>
-              </w:rPr>
-              <w:instrText xml:space="preserve"> PAGEREF _Toc223632442 \h </w:instrText>
-            </w:r>
-            <w:r>
-              <w:rPr>
-                <w:rFonts w:ascii="Verdana" w:hAnsi="Verdana"/>
-                <w:noProof/>
-                <w:webHidden/>
-              </w:rPr>
-            </w:r>
-            <w:r>
-              <w:rPr>
-                <w:rFonts w:ascii="Verdana" w:hAnsi="Verdana"/>
+                <w:noProof/>
+                <w:webHidden/>
+              </w:rPr>
+              <w:instrText xml:space="preserve"> PAGEREF _Toc223636903 \h </w:instrText>
+            </w:r>
+            <w:r>
+              <w:rPr>
+                <w:noProof/>
+                <w:webHidden/>
+              </w:rPr>
+            </w:r>
+            <w:r>
+              <w:rPr>
                 <w:noProof/>
                 <w:webHidden/>
               </w:rPr>
@@ -288,7 +262,6 @@
             </w:r>
             <w:r>
               <w:rPr>
-                <w:rFonts w:ascii="Verdana" w:hAnsi="Verdana"/>
                 <w:noProof/>
                 <w:webHidden/>
               </w:rPr>
@@ -296,7 +269,6 @@
             </w:r>
             <w:r>
               <w:rPr>
-                <w:rFonts w:ascii="Verdana" w:hAnsi="Verdana"/>
                 <w:noProof/>
                 <w:webHidden/>
               </w:rPr>
@@ -311,7 +283,6 @@
               <w:tab w:val="right" w:leader="dot" w:pos="10790"/>
             </w:tabs>
             <w:rPr>
-              <w:rFonts w:ascii="Verdana" w:hAnsi="Verdana"/>
               <w:noProof/>
               <w:kern w:val="2"/>
               <w:sz w:val="24"/>
@@ -320,46 +291,44 @@
               <w14:ligatures w14:val="standardContextual"/>
             </w:rPr>
           </w:pPr>
-          <w:hyperlink w:anchor="_Toc223632443" w:history="1">
+          <w:hyperlink w:anchor="_Toc223636904" w:history="1">
             <w:r>
               <w:rPr>
                 <w:rStyle w:val="Hyperlink"/>
-                <w:rFonts w:ascii="Verdana" w:hAnsi="Verdana"/>
-                <w:noProof/>
-                <w:lang w:val="en-GB"/>
-              </w:rPr>
-              <w:t>Landscape s</w:t>
+                <w:noProof/>
+              </w:rPr>
+              <w:t>Landscape scr</w:t>
             </w:r>
             <w:r>
               <w:rPr>
                 <w:rStyle w:val="Hyperlink"/>
-                <w:rFonts w:ascii="Verdana" w:hAnsi="Verdana"/>
-                <w:noProof/>
-                <w:lang w:val="en-GB"/>
-              </w:rPr>
-              <w:t>c</w:t>
+                <w:noProof/>
+              </w:rPr>
+              <w:t>e</w:t>
             </w:r>
             <w:r>
               <w:rPr>
                 <w:rStyle w:val="Hyperlink"/>
-                <w:rFonts w:ascii="Verdana" w:hAnsi="Verdana"/>
-                <w:noProof/>
-                <w:lang w:val="en-GB"/>
-              </w:rPr>
-              <w:t>reen shot</w:t>
+                <w:noProof/>
+              </w:rPr>
+              <w:t>e</w:t>
             </w:r>
             <w:r>
               <w:rPr>
                 <w:rStyle w:val="Hyperlink"/>
-                <w:rFonts w:ascii="Verdana" w:hAnsi="Verdana"/>
-                <w:noProof/>
-                <w:lang w:val="en-DK"/>
-              </w:rPr>
-              <w:t>s.</w:t>
-            </w:r>
-            <w:r>
-              <w:rPr>
-                <w:rFonts w:ascii="Verdana" w:hAnsi="Verdana"/>
+                <w:noProof/>
+              </w:rPr>
+              <w:t>n</w:t>
+            </w:r>
+            <w:r>
+              <w:rPr>
+                <w:rStyle w:val="Hyperlink"/>
+                <w:noProof/>
+              </w:rPr>
+              <w:t xml:space="preserve"> shots.</w:t>
+            </w:r>
+            <w:r>
+              <w:rPr>
                 <w:noProof/>
                 <w:webHidden/>
               </w:rPr>
@@ -367,7 +336,6 @@
             </w:r>
             <w:r>
               <w:rPr>
-                <w:rFonts w:ascii="Verdana" w:hAnsi="Verdana"/>
                 <w:noProof/>
                 <w:webHidden/>
               </w:rPr>
@@ -375,22 +343,19 @@
             </w:r>
             <w:r>
               <w:rPr>
-                <w:rFonts w:ascii="Verdana" w:hAnsi="Verdana"/>
-                <w:noProof/>
-                <w:webHidden/>
-              </w:rPr>
-              <w:instrText xml:space="preserve"> PAGEREF _Toc223632443 \h </w:instrText>
-            </w:r>
-            <w:r>
-              <w:rPr>
-                <w:rFonts w:ascii="Verdana" w:hAnsi="Verdana"/>
-                <w:noProof/>
-                <w:webHidden/>
-              </w:rPr>
-            </w:r>
-            <w:r>
-              <w:rPr>
-                <w:rFonts w:ascii="Verdana" w:hAnsi="Verdana"/>
+                <w:noProof/>
+                <w:webHidden/>
+              </w:rPr>
+              <w:instrText xml:space="preserve"> PAGEREF _Toc223636904 \h </w:instrText>
+            </w:r>
+            <w:r>
+              <w:rPr>
+                <w:noProof/>
+                <w:webHidden/>
+              </w:rPr>
+            </w:r>
+            <w:r>
+              <w:rPr>
                 <w:noProof/>
                 <w:webHidden/>
               </w:rPr>
@@ -398,15 +363,13 @@
             </w:r>
             <w:r>
               <w:rPr>
-                <w:rFonts w:ascii="Verdana" w:hAnsi="Verdana"/>
-                <w:noProof/>
-                <w:webHidden/>
-              </w:rPr>
-              <w:t>5</w:t>
-            </w:r>
-            <w:r>
-              <w:rPr>
-                <w:rFonts w:ascii="Verdana" w:hAnsi="Verdana"/>
+                <w:noProof/>
+                <w:webHidden/>
+              </w:rPr>
+              <w:t>4</w:t>
+            </w:r>
+            <w:r>
+              <w:rPr>
                 <w:noProof/>
                 <w:webHidden/>
               </w:rPr>
@@ -421,7 +384,6 @@
               <w:tab w:val="right" w:leader="dot" w:pos="10790"/>
             </w:tabs>
             <w:rPr>
-              <w:rFonts w:ascii="Verdana" w:hAnsi="Verdana"/>
               <w:noProof/>
               <w:kern w:val="2"/>
               <w:sz w:val="24"/>
@@ -430,7 +392,7 @@
               <w14:ligatures w14:val="standardContextual"/>
             </w:rPr>
           </w:pPr>
-          <w:hyperlink w:anchor="_Toc223632444" w:history="1">
+          <w:hyperlink w:anchor="_Toc223636905" w:history="1">
             <w:r>
               <w:rPr>
                 <w:rStyle w:val="Hyperlink"/>
@@ -458,7 +420,6 @@
             </w:r>
             <w:r>
               <w:rPr>
-                <w:rFonts w:ascii="Verdana" w:hAnsi="Verdana"/>
                 <w:noProof/>
                 <w:webHidden/>
               </w:rPr>
@@ -466,7 +427,6 @@
             </w:r>
             <w:r>
               <w:rPr>
-                <w:rFonts w:ascii="Verdana" w:hAnsi="Verdana"/>
                 <w:noProof/>
                 <w:webHidden/>
               </w:rPr>
@@ -474,22 +434,19 @@
             </w:r>
             <w:r>
               <w:rPr>
-                <w:rFonts w:ascii="Verdana" w:hAnsi="Verdana"/>
-                <w:noProof/>
-                <w:webHidden/>
-              </w:rPr>
-              <w:instrText xml:space="preserve"> PAGEREF _Toc223632444 \h </w:instrText>
-            </w:r>
-            <w:r>
-              <w:rPr>
-                <w:rFonts w:ascii="Verdana" w:hAnsi="Verdana"/>
-                <w:noProof/>
-                <w:webHidden/>
-              </w:rPr>
-            </w:r>
-            <w:r>
-              <w:rPr>
-                <w:rFonts w:ascii="Verdana" w:hAnsi="Verdana"/>
+                <w:noProof/>
+                <w:webHidden/>
+              </w:rPr>
+              <w:instrText xml:space="preserve"> PAGEREF _Toc223636905 \h </w:instrText>
+            </w:r>
+            <w:r>
+              <w:rPr>
+                <w:noProof/>
+                <w:webHidden/>
+              </w:rPr>
+            </w:r>
+            <w:r>
+              <w:rPr>
                 <w:noProof/>
                 <w:webHidden/>
               </w:rPr>
@@ -497,15 +454,13 @@
             </w:r>
             <w:r>
               <w:rPr>
-                <w:rFonts w:ascii="Verdana" w:hAnsi="Verdana"/>
-                <w:noProof/>
-                <w:webHidden/>
-              </w:rPr>
-              <w:t>10</w:t>
-            </w:r>
-            <w:r>
-              <w:rPr>
-                <w:rFonts w:ascii="Verdana" w:hAnsi="Verdana"/>
+                <w:noProof/>
+                <w:webHidden/>
+              </w:rPr>
+              <w:t>9</w:t>
+            </w:r>
+            <w:r>
+              <w:rPr>
                 <w:noProof/>
                 <w:webHidden/>
               </w:rPr>
@@ -520,7 +475,6 @@
               <w:tab w:val="right" w:leader="dot" w:pos="10790"/>
             </w:tabs>
             <w:rPr>
-              <w:rFonts w:ascii="Verdana" w:hAnsi="Verdana"/>
               <w:noProof/>
               <w:kern w:val="2"/>
               <w:sz w:val="24"/>
@@ -529,7 +483,7 @@
               <w14:ligatures w14:val="standardContextual"/>
             </w:rPr>
           </w:pPr>
-          <w:hyperlink w:anchor="_Toc223632445" w:history="1">
+          <w:hyperlink w:anchor="_Toc223636906" w:history="1">
             <w:r>
               <w:rPr>
                 <w:rStyle w:val="Hyperlink"/>
@@ -540,7 +494,6 @@
             </w:r>
             <w:r>
               <w:rPr>
-                <w:rFonts w:ascii="Verdana" w:hAnsi="Verdana"/>
                 <w:noProof/>
                 <w:webHidden/>
               </w:rPr>
@@ -548,7 +501,6 @@
             </w:r>
             <w:r>
               <w:rPr>
-                <w:rFonts w:ascii="Verdana" w:hAnsi="Verdana"/>
                 <w:noProof/>
                 <w:webHidden/>
               </w:rPr>
@@ -556,22 +508,19 @@
             </w:r>
             <w:r>
               <w:rPr>
-                <w:rFonts w:ascii="Verdana" w:hAnsi="Verdana"/>
-                <w:noProof/>
-                <w:webHidden/>
-              </w:rPr>
-              <w:instrText xml:space="preserve"> PAGEREF _Toc223632445 \h </w:instrText>
-            </w:r>
-            <w:r>
-              <w:rPr>
-                <w:rFonts w:ascii="Verdana" w:hAnsi="Verdana"/>
-                <w:noProof/>
-                <w:webHidden/>
-              </w:rPr>
-            </w:r>
-            <w:r>
-              <w:rPr>
-                <w:rFonts w:ascii="Verdana" w:hAnsi="Verdana"/>
+                <w:noProof/>
+                <w:webHidden/>
+              </w:rPr>
+              <w:instrText xml:space="preserve"> PAGEREF _Toc223636906 \h </w:instrText>
+            </w:r>
+            <w:r>
+              <w:rPr>
+                <w:noProof/>
+                <w:webHidden/>
+              </w:rPr>
+            </w:r>
+            <w:r>
+              <w:rPr>
                 <w:noProof/>
                 <w:webHidden/>
               </w:rPr>
@@ -579,7 +528,6 @@
             </w:r>
             <w:r>
               <w:rPr>
-                <w:rFonts w:ascii="Verdana" w:hAnsi="Verdana"/>
                 <w:noProof/>
                 <w:webHidden/>
               </w:rPr>
@@ -587,7 +535,6 @@
             </w:r>
             <w:r>
               <w:rPr>
-                <w:rFonts w:ascii="Verdana" w:hAnsi="Verdana"/>
                 <w:noProof/>
                 <w:webHidden/>
               </w:rPr>
@@ -602,7 +549,6 @@
               <w:tab w:val="right" w:leader="dot" w:pos="10790"/>
             </w:tabs>
             <w:rPr>
-              <w:rFonts w:ascii="Verdana" w:hAnsi="Verdana"/>
               <w:noProof/>
               <w:kern w:val="2"/>
               <w:sz w:val="24"/>
@@ -611,7 +557,7 @@
               <w14:ligatures w14:val="standardContextual"/>
             </w:rPr>
           </w:pPr>
-          <w:hyperlink w:anchor="_Toc223632446" w:history="1">
+          <w:hyperlink w:anchor="_Toc223636907" w:history="1">
             <w:r>
               <w:rPr>
                 <w:rStyle w:val="Hyperlink"/>
@@ -622,7 +568,6 @@
             </w:r>
             <w:r>
               <w:rPr>
-                <w:rFonts w:ascii="Verdana" w:hAnsi="Verdana"/>
                 <w:noProof/>
                 <w:webHidden/>
               </w:rPr>
@@ -630,7 +575,6 @@
             </w:r>
             <w:r>
               <w:rPr>
-                <w:rFonts w:ascii="Verdana" w:hAnsi="Verdana"/>
                 <w:noProof/>
                 <w:webHidden/>
               </w:rPr>
@@ -638,22 +582,19 @@
             </w:r>
             <w:r>
               <w:rPr>
-                <w:rFonts w:ascii="Verdana" w:hAnsi="Verdana"/>
-                <w:noProof/>
-                <w:webHidden/>
-              </w:rPr>
-              <w:instrText xml:space="preserve"> PAGEREF _Toc223632446 \h </w:instrText>
-            </w:r>
-            <w:r>
-              <w:rPr>
-                <w:rFonts w:ascii="Verdana" w:hAnsi="Verdana"/>
-                <w:noProof/>
-                <w:webHidden/>
-              </w:rPr>
-            </w:r>
-            <w:r>
-              <w:rPr>
-                <w:rFonts w:ascii="Verdana" w:hAnsi="Verdana"/>
+                <w:noProof/>
+                <w:webHidden/>
+              </w:rPr>
+              <w:instrText xml:space="preserve"> PAGEREF _Toc223636907 \h </w:instrText>
+            </w:r>
+            <w:r>
+              <w:rPr>
+                <w:noProof/>
+                <w:webHidden/>
+              </w:rPr>
+            </w:r>
+            <w:r>
+              <w:rPr>
                 <w:noProof/>
                 <w:webHidden/>
               </w:rPr>
@@ -661,15 +602,13 @@
             </w:r>
             <w:r>
               <w:rPr>
-                <w:rFonts w:ascii="Verdana" w:hAnsi="Verdana"/>
-                <w:noProof/>
-                <w:webHidden/>
-              </w:rPr>
-              <w:t>20</w:t>
-            </w:r>
-            <w:r>
-              <w:rPr>
-                <w:rFonts w:ascii="Verdana" w:hAnsi="Verdana"/>
+                <w:noProof/>
+                <w:webHidden/>
+              </w:rPr>
+              <w:t>21</w:t>
+            </w:r>
+            <w:r>
+              <w:rPr>
                 <w:noProof/>
                 <w:webHidden/>
               </w:rPr>
@@ -684,7 +623,6 @@
               <w:tab w:val="right" w:leader="dot" w:pos="10790"/>
             </w:tabs>
             <w:rPr>
-              <w:rFonts w:ascii="Verdana" w:hAnsi="Verdana"/>
               <w:noProof/>
               <w:kern w:val="2"/>
               <w:sz w:val="24"/>
@@ -693,7 +631,7 @@
               <w14:ligatures w14:val="standardContextual"/>
             </w:rPr>
           </w:pPr>
-          <w:hyperlink w:anchor="_Toc223632447" w:history="1">
+          <w:hyperlink w:anchor="_Toc223636908" w:history="1">
             <w:r>
               <w:rPr>
                 <w:rStyle w:val="Hyperlink"/>
@@ -705,7 +643,6 @@
             </w:r>
             <w:r>
               <w:rPr>
-                <w:rFonts w:ascii="Verdana" w:hAnsi="Verdana"/>
                 <w:noProof/>
                 <w:webHidden/>
               </w:rPr>
@@ -713,7 +650,6 @@
             </w:r>
             <w:r>
               <w:rPr>
-                <w:rFonts w:ascii="Verdana" w:hAnsi="Verdana"/>
                 <w:noProof/>
                 <w:webHidden/>
               </w:rPr>
@@ -721,22 +657,19 @@
             </w:r>
             <w:r>
               <w:rPr>
-                <w:rFonts w:ascii="Verdana" w:hAnsi="Verdana"/>
-                <w:noProof/>
-                <w:webHidden/>
-              </w:rPr>
-              <w:instrText xml:space="preserve"> PAGEREF _Toc223632447 \h </w:instrText>
-            </w:r>
-            <w:r>
-              <w:rPr>
-                <w:rFonts w:ascii="Verdana" w:hAnsi="Verdana"/>
-                <w:noProof/>
-                <w:webHidden/>
-              </w:rPr>
-            </w:r>
-            <w:r>
-              <w:rPr>
-                <w:rFonts w:ascii="Verdana" w:hAnsi="Verdana"/>
+                <w:noProof/>
+                <w:webHidden/>
+              </w:rPr>
+              <w:instrText xml:space="preserve"> PAGEREF _Toc223636908 \h </w:instrText>
+            </w:r>
+            <w:r>
+              <w:rPr>
+                <w:noProof/>
+                <w:webHidden/>
+              </w:rPr>
+            </w:r>
+            <w:r>
+              <w:rPr>
                 <w:noProof/>
                 <w:webHidden/>
               </w:rPr>
@@ -744,15 +677,13 @@
             </w:r>
             <w:r>
               <w:rPr>
-                <w:rFonts w:ascii="Verdana" w:hAnsi="Verdana"/>
-                <w:noProof/>
-                <w:webHidden/>
-              </w:rPr>
-              <w:t>21</w:t>
-            </w:r>
-            <w:r>
-              <w:rPr>
-                <w:rFonts w:ascii="Verdana" w:hAnsi="Verdana"/>
+                <w:noProof/>
+                <w:webHidden/>
+              </w:rPr>
+              <w:t>22</w:t>
+            </w:r>
+            <w:r>
+              <w:rPr>
                 <w:noProof/>
                 <w:webHidden/>
               </w:rPr>
@@ -767,7 +698,6 @@
               <w:tab w:val="right" w:leader="dot" w:pos="10790"/>
             </w:tabs>
             <w:rPr>
-              <w:rFonts w:ascii="Verdana" w:hAnsi="Verdana"/>
               <w:noProof/>
               <w:kern w:val="2"/>
               <w:sz w:val="24"/>
@@ -776,7 +706,7 @@
               <w14:ligatures w14:val="standardContextual"/>
             </w:rPr>
           </w:pPr>
-          <w:hyperlink w:anchor="_Toc223632448" w:history="1">
+          <w:hyperlink w:anchor="_Toc223636909" w:history="1">
             <w:r>
               <w:rPr>
                 <w:rStyle w:val="Hyperlink"/>
@@ -788,7 +718,6 @@
             </w:r>
             <w:r>
               <w:rPr>
-                <w:rFonts w:ascii="Verdana" w:hAnsi="Verdana"/>
                 <w:noProof/>
                 <w:webHidden/>
               </w:rPr>
@@ -796,7 +725,6 @@
             </w:r>
             <w:r>
               <w:rPr>
-                <w:rFonts w:ascii="Verdana" w:hAnsi="Verdana"/>
                 <w:noProof/>
                 <w:webHidden/>
               </w:rPr>
@@ -804,22 +732,19 @@
             </w:r>
             <w:r>
               <w:rPr>
-                <w:rFonts w:ascii="Verdana" w:hAnsi="Verdana"/>
-                <w:noProof/>
-                <w:webHidden/>
-              </w:rPr>
-              <w:instrText xml:space="preserve"> PAGEREF _Toc223632448 \h </w:instrText>
-            </w:r>
-            <w:r>
-              <w:rPr>
-                <w:rFonts w:ascii="Verdana" w:hAnsi="Verdana"/>
-                <w:noProof/>
-                <w:webHidden/>
-              </w:rPr>
-            </w:r>
-            <w:r>
-              <w:rPr>
-                <w:rFonts w:ascii="Verdana" w:hAnsi="Verdana"/>
+                <w:noProof/>
+                <w:webHidden/>
+              </w:rPr>
+              <w:instrText xml:space="preserve"> PAGEREF _Toc223636909 \h </w:instrText>
+            </w:r>
+            <w:r>
+              <w:rPr>
+                <w:noProof/>
+                <w:webHidden/>
+              </w:rPr>
+            </w:r>
+            <w:r>
+              <w:rPr>
                 <w:noProof/>
                 <w:webHidden/>
               </w:rPr>
@@ -827,15 +752,13 @@
             </w:r>
             <w:r>
               <w:rPr>
-                <w:rFonts w:ascii="Verdana" w:hAnsi="Verdana"/>
-                <w:noProof/>
-                <w:webHidden/>
-              </w:rPr>
-              <w:t>21</w:t>
-            </w:r>
-            <w:r>
-              <w:rPr>
-                <w:rFonts w:ascii="Verdana" w:hAnsi="Verdana"/>
+                <w:noProof/>
+                <w:webHidden/>
+              </w:rPr>
+              <w:t>22</w:t>
+            </w:r>
+            <w:r>
+              <w:rPr>
                 <w:noProof/>
                 <w:webHidden/>
               </w:rPr>
@@ -850,11 +773,15 @@
               <w:tab w:val="right" w:leader="dot" w:pos="10790"/>
             </w:tabs>
             <w:rPr>
-              <w:rFonts w:ascii="Verdana" w:hAnsi="Verdana"/>
               <w:noProof/>
+              <w:kern w:val="2"/>
+              <w:sz w:val="24"/>
+              <w:szCs w:val="24"/>
+              <w:lang w:val="en-DK" w:eastAsia="en-DK"/>
+              <w14:ligatures w14:val="standardContextual"/>
             </w:rPr>
           </w:pPr>
-          <w:hyperlink w:anchor="_Toc223632449" w:history="1">
+          <w:hyperlink w:anchor="_Toc223636910" w:history="1">
             <w:r>
               <w:rPr>
                 <w:rStyle w:val="Hyperlink"/>
@@ -866,7 +793,6 @@
             </w:r>
             <w:r>
               <w:rPr>
-                <w:rFonts w:ascii="Verdana" w:hAnsi="Verdana"/>
                 <w:noProof/>
                 <w:webHidden/>
               </w:rPr>
@@ -874,7 +800,6 @@
             </w:r>
             <w:r>
               <w:rPr>
-                <w:rFonts w:ascii="Verdana" w:hAnsi="Verdana"/>
                 <w:noProof/>
                 <w:webHidden/>
               </w:rPr>
@@ -882,22 +807,19 @@
             </w:r>
             <w:r>
               <w:rPr>
-                <w:rFonts w:ascii="Verdana" w:hAnsi="Verdana"/>
-                <w:noProof/>
-                <w:webHidden/>
-              </w:rPr>
-              <w:instrText xml:space="preserve"> PAGEREF _Toc223632449 \h </w:instrText>
-            </w:r>
-            <w:r>
-              <w:rPr>
-                <w:rFonts w:ascii="Verdana" w:hAnsi="Verdana"/>
-                <w:noProof/>
-                <w:webHidden/>
-              </w:rPr>
-            </w:r>
-            <w:r>
-              <w:rPr>
-                <w:rFonts w:ascii="Verdana" w:hAnsi="Verdana"/>
+                <w:noProof/>
+                <w:webHidden/>
+              </w:rPr>
+              <w:instrText xml:space="preserve"> PAGEREF _Toc223636910 \h </w:instrText>
+            </w:r>
+            <w:r>
+              <w:rPr>
+                <w:noProof/>
+                <w:webHidden/>
+              </w:rPr>
+            </w:r>
+            <w:r>
+              <w:rPr>
                 <w:noProof/>
                 <w:webHidden/>
               </w:rPr>
@@ -905,15 +827,13 @@
             </w:r>
             <w:r>
               <w:rPr>
-                <w:rFonts w:ascii="Verdana" w:hAnsi="Verdana"/>
-                <w:noProof/>
-                <w:webHidden/>
-              </w:rPr>
-              <w:t>21</w:t>
-            </w:r>
-            <w:r>
-              <w:rPr>
-                <w:rFonts w:ascii="Verdana" w:hAnsi="Verdana"/>
+                <w:noProof/>
+                <w:webHidden/>
+              </w:rPr>
+              <w:t>22</w:t>
+            </w:r>
+            <w:r>
+              <w:rPr>
                 <w:noProof/>
                 <w:webHidden/>
               </w:rPr>
@@ -928,7 +848,6 @@
               <w:tab w:val="right" w:leader="dot" w:pos="10790"/>
             </w:tabs>
             <w:rPr>
-              <w:rFonts w:ascii="Verdana" w:hAnsi="Verdana"/>
               <w:noProof/>
               <w:kern w:val="2"/>
               <w:sz w:val="24"/>
@@ -937,7 +856,7 @@
               <w14:ligatures w14:val="standardContextual"/>
             </w:rPr>
           </w:pPr>
-          <w:hyperlink w:anchor="_Toc223632450" w:history="1">
+          <w:hyperlink w:anchor="_Toc223636911" w:history="1">
             <w:r>
               <w:rPr>
                 <w:rStyle w:val="Hyperlink"/>
@@ -949,7 +868,6 @@
             </w:r>
             <w:r>
               <w:rPr>
-                <w:rFonts w:ascii="Verdana" w:hAnsi="Verdana"/>
                 <w:noProof/>
                 <w:webHidden/>
               </w:rPr>
@@ -957,7 +875,6 @@
             </w:r>
             <w:r>
               <w:rPr>
-                <w:rFonts w:ascii="Verdana" w:hAnsi="Verdana"/>
                 <w:noProof/>
                 <w:webHidden/>
               </w:rPr>
@@ -965,22 +882,19 @@
             </w:r>
             <w:r>
               <w:rPr>
-                <w:rFonts w:ascii="Verdana" w:hAnsi="Verdana"/>
-                <w:noProof/>
-                <w:webHidden/>
-              </w:rPr>
-              <w:instrText xml:space="preserve"> PAGEREF _Toc223632450 \h </w:instrText>
-            </w:r>
-            <w:r>
-              <w:rPr>
-                <w:rFonts w:ascii="Verdana" w:hAnsi="Verdana"/>
-                <w:noProof/>
-                <w:webHidden/>
-              </w:rPr>
-            </w:r>
-            <w:r>
-              <w:rPr>
-                <w:rFonts w:ascii="Verdana" w:hAnsi="Verdana"/>
+                <w:noProof/>
+                <w:webHidden/>
+              </w:rPr>
+              <w:instrText xml:space="preserve"> PAGEREF _Toc223636911 \h </w:instrText>
+            </w:r>
+            <w:r>
+              <w:rPr>
+                <w:noProof/>
+                <w:webHidden/>
+              </w:rPr>
+            </w:r>
+            <w:r>
+              <w:rPr>
                 <w:noProof/>
                 <w:webHidden/>
               </w:rPr>
@@ -988,15 +902,13 @@
             </w:r>
             <w:r>
               <w:rPr>
-                <w:rFonts w:ascii="Verdana" w:hAnsi="Verdana"/>
-                <w:noProof/>
-                <w:webHidden/>
-              </w:rPr>
-              <w:t>21</w:t>
-            </w:r>
-            <w:r>
-              <w:rPr>
-                <w:rFonts w:ascii="Verdana" w:hAnsi="Verdana"/>
+                <w:noProof/>
+                <w:webHidden/>
+              </w:rPr>
+              <w:t>22</w:t>
+            </w:r>
+            <w:r>
+              <w:rPr>
                 <w:noProof/>
                 <w:webHidden/>
               </w:rPr>
@@ -1011,7 +923,6 @@
               <w:tab w:val="right" w:leader="dot" w:pos="10790"/>
             </w:tabs>
             <w:rPr>
-              <w:rFonts w:ascii="Verdana" w:hAnsi="Verdana"/>
               <w:noProof/>
               <w:kern w:val="2"/>
               <w:sz w:val="24"/>
@@ -1020,18 +931,166 @@
               <w14:ligatures w14:val="standardContextual"/>
             </w:rPr>
           </w:pPr>
-          <w:hyperlink w:anchor="_Toc223632451" w:history="1">
+          <w:hyperlink w:anchor="_Toc223636912" w:history="1">
             <w:r>
               <w:rPr>
                 <w:rStyle w:val="Hyperlink"/>
                 <w:rFonts w:ascii="Verdana" w:hAnsi="Verdana"/>
                 <w:noProof/>
+                <w:lang w:val="en-GB"/>
+              </w:rPr>
+              <w:t>Settings (Not on phones)</w:t>
+            </w:r>
+            <w:r>
+              <w:rPr>
+                <w:noProof/>
+                <w:webHidden/>
+              </w:rPr>
+              <w:tab/>
+            </w:r>
+            <w:r>
+              <w:rPr>
+                <w:noProof/>
+                <w:webHidden/>
+              </w:rPr>
+              <w:fldChar w:fldCharType="begin"/>
+            </w:r>
+            <w:r>
+              <w:rPr>
+                <w:noProof/>
+                <w:webHidden/>
+              </w:rPr>
+              <w:instrText xml:space="preserve"> PAGEREF _Toc223636912 \h </w:instrText>
+            </w:r>
+            <w:r>
+              <w:rPr>
+                <w:noProof/>
+                <w:webHidden/>
+              </w:rPr>
+            </w:r>
+            <w:r>
+              <w:rPr>
+                <w:noProof/>
+                <w:webHidden/>
+              </w:rPr>
+              <w:fldChar w:fldCharType="separate"/>
+            </w:r>
+            <w:r>
+              <w:rPr>
+                <w:noProof/>
+                <w:webHidden/>
+              </w:rPr>
+              <w:t>23</w:t>
+            </w:r>
+            <w:r>
+              <w:rPr>
+                <w:noProof/>
+                <w:webHidden/>
+              </w:rPr>
+              <w:fldChar w:fldCharType="end"/>
+            </w:r>
+          </w:hyperlink>
+        </w:p>
+        <w:p>
+          <w:pPr>
+            <w:pStyle w:val="TOC2"/>
+            <w:tabs>
+              <w:tab w:val="right" w:leader="dot" w:pos="10790"/>
+            </w:tabs>
+            <w:rPr>
+              <w:noProof/>
+              <w:kern w:val="2"/>
+              <w:sz w:val="24"/>
+              <w:szCs w:val="24"/>
+              <w:lang w:val="en-DK" w:eastAsia="en-DK"/>
+              <w14:ligatures w14:val="standardContextual"/>
+            </w:rPr>
+          </w:pPr>
+          <w:hyperlink w:anchor="_Toc223636913" w:history="1">
+            <w:r>
+              <w:rPr>
+                <w:rStyle w:val="Hyperlink"/>
+                <w:noProof/>
+                <w:lang w:val="en-GB"/>
+              </w:rPr>
+              <w:t>Zoom to window.</w:t>
+            </w:r>
+            <w:r>
+              <w:rPr>
+                <w:noProof/>
+                <w:webHidden/>
+              </w:rPr>
+              <w:tab/>
+            </w:r>
+            <w:r>
+              <w:rPr>
+                <w:noProof/>
+                <w:webHidden/>
+              </w:rPr>
+              <w:fldChar w:fldCharType="begin"/>
+            </w:r>
+            <w:r>
+              <w:rPr>
+                <w:noProof/>
+                <w:webHidden/>
+              </w:rPr>
+              <w:instrText xml:space="preserve"> PAGEREF _Toc223636913 \h </w:instrText>
+            </w:r>
+            <w:r>
+              <w:rPr>
+                <w:noProof/>
+                <w:webHidden/>
+              </w:rPr>
+            </w:r>
+            <w:r>
+              <w:rPr>
+                <w:noProof/>
+                <w:webHidden/>
+              </w:rPr>
+              <w:fldChar w:fldCharType="separate"/>
+            </w:r>
+            <w:r>
+              <w:rPr>
+                <w:noProof/>
+                <w:webHidden/>
+              </w:rPr>
+              <w:t>23</w:t>
+            </w:r>
+            <w:r>
+              <w:rPr>
+                <w:noProof/>
+                <w:webHidden/>
+              </w:rPr>
+              <w:fldChar w:fldCharType="end"/>
+            </w:r>
+          </w:hyperlink>
+        </w:p>
+        <w:p>
+          <w:pPr>
+            <w:pStyle w:val="TOC1"/>
+            <w:tabs>
+              <w:tab w:val="right" w:leader="dot" w:pos="10790"/>
+            </w:tabs>
+            <w:rPr>
+              <w:noProof/>
+              <w:kern w:val="2"/>
+              <w:sz w:val="24"/>
+              <w:szCs w:val="24"/>
+              <w:lang w:val="en-DK" w:eastAsia="en-DK"/>
+              <w14:ligatures w14:val="standardContextual"/>
+            </w:rPr>
+          </w:pPr>
+          <w:hyperlink w:anchor="_Toc223636914" w:history="1">
+            <w:r>
+              <w:rPr>
+                <w:rStyle w:val="Hyperlink"/>
+                <w:rFonts w:ascii="Verdana" w:hAnsi="Verdana"/>
+                <w:noProof/>
               </w:rPr>
               <w:t>Have a good time!</w:t>
             </w:r>
             <w:r>
               <w:rPr>
-                <w:rFonts w:ascii="Verdana" w:hAnsi="Verdana"/>
                 <w:noProof/>
                 <w:webHidden/>
               </w:rPr>
@@ -1039,7 +1098,6 @@
             </w:r>
             <w:r>
               <w:rPr>
-                <w:rFonts w:ascii="Verdana" w:hAnsi="Verdana"/>
                 <w:noProof/>
                 <w:webHidden/>
               </w:rPr>
@@ -1047,22 +1105,19 @@
             </w:r>
             <w:r>
               <w:rPr>
-                <w:rFonts w:ascii="Verdana" w:hAnsi="Verdana"/>
-                <w:noProof/>
-                <w:webHidden/>
-              </w:rPr>
-              <w:instrText xml:space="preserve"> PAGEREF _Toc223632451 \h </w:instrText>
-            </w:r>
-            <w:r>
-              <w:rPr>
-                <w:rFonts w:ascii="Verdana" w:hAnsi="Verdana"/>
-                <w:noProof/>
-                <w:webHidden/>
-              </w:rPr>
-            </w:r>
-            <w:r>
-              <w:rPr>
-                <w:rFonts w:ascii="Verdana" w:hAnsi="Verdana"/>
+                <w:noProof/>
+                <w:webHidden/>
+              </w:rPr>
+              <w:instrText xml:space="preserve"> PAGEREF _Toc223636914 \h </w:instrText>
+            </w:r>
+            <w:r>
+              <w:rPr>
+                <w:noProof/>
+                <w:webHidden/>
+              </w:rPr>
+            </w:r>
+            <w:r>
+              <w:rPr>
                 <w:noProof/>
                 <w:webHidden/>
               </w:rPr>
@@ -1070,15 +1125,13 @@
             </w:r>
             <w:r>
               <w:rPr>
-                <w:rFonts w:ascii="Verdana" w:hAnsi="Verdana"/>
-                <w:noProof/>
-                <w:webHidden/>
-              </w:rPr>
-              <w:t>22</w:t>
-            </w:r>
-            <w:r>
-              <w:rPr>
-                <w:rFonts w:ascii="Verdana" w:hAnsi="Verdana"/>
+                <w:noProof/>
+                <w:webHidden/>
+              </w:rPr>
+              <w:t>24</w:t>
+            </w:r>
+            <w:r>
+              <w:rPr>
                 <w:noProof/>
                 <w:webHidden/>
               </w:rPr>
@@ -1125,12 +1178,11 @@
         </w:rPr>
       </w:pPr>
       <w:bookmarkStart w:id="0" w:name="_Toc223550819"/>
-      <w:bookmarkStart w:id="1" w:name="_Toc223632441"/>
-      <w:r>
-        <w:rPr>
-          <w:rFonts w:ascii="Verdana" w:hAnsi="Verdana"/>
-        </w:rPr>
-        <w:lastRenderedPageBreak/>
+      <w:bookmarkStart w:id="1" w:name="_Toc223636902"/>
+      <w:r>
+        <w:rPr>
+          <w:rFonts w:ascii="Verdana" w:hAnsi="Verdana"/>
+        </w:rPr>
         <w:t>ChronoWiz in short.</w:t>
       </w:r>
       <w:bookmarkEnd w:id="0"/>
@@ -1301,27 +1353,17 @@
     <w:p>
       <w:pPr>
         <w:pStyle w:val="Heading1"/>
-        <w:rPr>
-          <w:rFonts w:ascii="Verdana" w:hAnsi="Verdana"/>
-        </w:rPr>
       </w:pPr>
       <w:bookmarkStart w:id="3" w:name="_Toc78485141"/>
       <w:bookmarkStart w:id="4" w:name="_Toc223550820"/>
-      <w:bookmarkStart w:id="5" w:name="_Toc223632442"/>
+      <w:bookmarkStart w:id="5" w:name="_Toc223636903"/>
       <w:r>
         <w:rPr>
           <w:rStyle w:val="Heading1Char"/>
-          <w:rFonts w:ascii="Verdana" w:hAnsi="Verdana"/>
-          <w:b/>
-          <w:bCs/>
-        </w:rPr>
-        <w:lastRenderedPageBreak/>
+        </w:rPr>
         <w:t>Screen shots</w:t>
       </w:r>
       <w:r>
-        <w:rPr>
-          <w:rFonts w:ascii="Verdana" w:hAnsi="Verdana"/>
-        </w:rPr>
         <w:t>.</w:t>
       </w:r>
       <w:bookmarkEnd w:id="3"/>
@@ -1339,50 +1381,45 @@
       <w:pPr>
         <w:pStyle w:val="Heading2"/>
         <w:rPr>
-          <w:rStyle w:val="Heading2Char"/>
-          <w:rFonts w:ascii="Verdana" w:hAnsi="Verdana"/>
-          <w:lang w:val="en-DK"/>
+          <w:noProof/>
         </w:rPr>
       </w:pPr>
       <w:bookmarkStart w:id="6" w:name="_Toc78485142"/>
       <w:bookmarkStart w:id="7" w:name="_Toc223550821"/>
-      <w:bookmarkStart w:id="8" w:name="_Toc223632443"/>
+      <w:bookmarkStart w:id="8" w:name="_Toc223636904"/>
       <w:r>
         <w:rPr>
           <w:rStyle w:val="Heading2Char"/>
-          <w:rFonts w:ascii="Verdana" w:hAnsi="Verdana"/>
-          <w:lang w:val="en-GB"/>
-        </w:rPr>
-        <w:t>Landscape screen shot</w:t>
-      </w:r>
-      <w:r>
-        <w:rPr>
-          <w:rStyle w:val="Heading2Char"/>
-          <w:rFonts w:ascii="Verdana" w:hAnsi="Verdana"/>
-          <w:lang w:val="en-DK"/>
-        </w:rPr>
-        <w:t>s.</w:t>
+        </w:rPr>
+        <w:t>Landscape screen shots.</w:t>
       </w:r>
       <w:bookmarkEnd w:id="6"/>
       <w:bookmarkEnd w:id="7"/>
       <w:bookmarkEnd w:id="8"/>
-    </w:p>
-    <w:p>
-      <w:pPr>
-        <w:rPr>
-          <w:rFonts w:ascii="Verdana" w:hAnsi="Verdana"/>
-        </w:rPr>
-      </w:pPr>
-      <w:r>
-        <w:rPr>
-          <w:rFonts w:ascii="Verdana" w:hAnsi="Verdana"/>
+      <w:r>
+        <w:rPr>
           <w:noProof/>
         </w:rPr>
+        <w:t xml:space="preserve"> </w:t>
+      </w:r>
+    </w:p>
+    <w:p>
+      <w:pPr>
+        <w:rPr>
+          <w:rStyle w:val="Heading2Char"/>
+          <w:rFonts w:ascii="Verdana" w:hAnsi="Verdana"/>
+          <w:lang w:val="en-DK"/>
+        </w:rPr>
+      </w:pPr>
+      <w:r>
+        <w:rPr>
+          <w:noProof/>
+        </w:rPr>
         <w:drawing>
-          <wp:inline distT="0" distB="0" distL="0" distR="0" wp14:anchorId="6EDD661E" wp14:editId="0DFEAAC1">
-            <wp:extent cx="6172835" cy="3356864"/>
-            <wp:effectExtent l="0" t="0" r="0" b="0"/>
-            <wp:docPr id="1869459917" name="Picture 2"/>
+          <wp:inline distT="0" distB="0" distL="0" distR="0" wp14:anchorId="33A52AD9" wp14:editId="626990C9">
+            <wp:extent cx="6134100" cy="3839145"/>
+            <wp:effectExtent l="0" t="0" r="0" b="9525"/>
+            <wp:docPr id="736668384" name="Picture 2"/>
             <wp:cNvGraphicFramePr>
               <a:graphicFrameLocks xmlns:a="http://schemas.openxmlformats.org/drawingml/2006/main" noChangeAspect="1"/>
             </wp:cNvGraphicFramePr>
@@ -1411,7 +1448,7 @@
                   <pic:spPr bwMode="auto">
                     <a:xfrm>
                       <a:off x="0" y="0"/>
-                      <a:ext cx="6180700" cy="3361141"/>
+                      <a:ext cx="6141868" cy="3844007"/>
                     </a:xfrm>
                     <a:prstGeom prst="rect">
                       <a:avLst/>
@@ -1439,12 +1476,11 @@
           <w:rFonts w:ascii="Verdana" w:hAnsi="Verdana"/>
           <w:noProof/>
         </w:rPr>
-        <w:lastRenderedPageBreak/>
         <w:drawing>
-          <wp:inline distT="0" distB="0" distL="0" distR="0" wp14:anchorId="7424B5F2" wp14:editId="76B98458">
-            <wp:extent cx="6115685" cy="3218815"/>
-            <wp:effectExtent l="57150" t="19050" r="56515" b="95885"/>
-            <wp:docPr id="2" name="Picture 2"/>
+          <wp:inline distT="0" distB="0" distL="0" distR="0" wp14:anchorId="61587A49" wp14:editId="7F7A04FE">
+            <wp:extent cx="6134100" cy="3833813"/>
+            <wp:effectExtent l="0" t="0" r="0" b="0"/>
+            <wp:docPr id="126495293" name="Picture 11"/>
             <wp:cNvGraphicFramePr>
               <a:graphicFrameLocks xmlns:a="http://schemas.openxmlformats.org/drawingml/2006/main" noChangeAspect="1"/>
             </wp:cNvGraphicFramePr>
@@ -1452,16 +1488,16 @@
               <a:graphicData uri="http://schemas.openxmlformats.org/drawingml/2006/picture">
                 <pic:pic xmlns:pic="http://schemas.openxmlformats.org/drawingml/2006/picture">
                   <pic:nvPicPr>
-                    <pic:cNvPr id="0" name="Picture 2"/>
+                    <pic:cNvPr id="0" name="Picture 19"/>
                     <pic:cNvPicPr>
                       <a:picLocks noChangeAspect="1" noChangeArrowheads="1"/>
                     </pic:cNvPicPr>
                   </pic:nvPicPr>
                   <pic:blipFill>
-                    <a:blip r:embed="rId9">
+                    <a:blip r:embed="rId9" cstate="print">
                       <a:extLst>
                         <a:ext uri="{28A0092B-C50C-407E-A947-70E740481C1C}">
-                          <a14:useLocalDpi xmlns:a14="http://schemas.microsoft.com/office/drawing/2010/main"/>
+                          <a14:useLocalDpi xmlns:a14="http://schemas.microsoft.com/office/drawing/2010/main" val="0"/>
                         </a:ext>
                       </a:extLst>
                     </a:blip>
@@ -1473,7 +1509,7 @@
                   <pic:spPr bwMode="auto">
                     <a:xfrm>
                       <a:off x="0" y="0"/>
-                      <a:ext cx="6115685" cy="3218815"/>
+                      <a:ext cx="6135627" cy="3834767"/>
                     </a:xfrm>
                     <a:prstGeom prst="rect">
                       <a:avLst/>
@@ -1482,13 +1518,6 @@
                     <a:ln>
                       <a:noFill/>
                     </a:ln>
-                    <a:effectLst>
-                      <a:outerShdw blurRad="50800" dist="38100" dir="5400000" algn="t" rotWithShape="0">
-                        <a:prstClr val="black">
-                          <a:alpha val="40000"/>
-                        </a:prstClr>
-                      </a:outerShdw>
-                    </a:effectLst>
                   </pic:spPr>
                 </pic:pic>
               </a:graphicData>
@@ -1496,16 +1525,23 @@
           </wp:inline>
         </w:drawing>
       </w:r>
+    </w:p>
+    <w:p>
+      <w:pPr>
+        <w:rPr>
+          <w:rFonts w:ascii="Verdana" w:hAnsi="Verdana"/>
+        </w:rPr>
+      </w:pPr>
       <w:r>
         <w:rPr>
           <w:rFonts w:ascii="Verdana" w:hAnsi="Verdana"/>
           <w:noProof/>
         </w:rPr>
         <w:drawing>
-          <wp:inline distT="0" distB="0" distL="0" distR="0" wp14:anchorId="20AD6B38" wp14:editId="37F6FB64">
-            <wp:extent cx="6114415" cy="3220085"/>
-            <wp:effectExtent l="57150" t="19050" r="57785" b="94615"/>
-            <wp:docPr id="14" name="Picture 14"/>
+          <wp:inline distT="0" distB="0" distL="0" distR="0" wp14:anchorId="3D296103" wp14:editId="4AA1569C">
+            <wp:extent cx="6105525" cy="3815953"/>
+            <wp:effectExtent l="0" t="0" r="0" b="0"/>
+            <wp:docPr id="2078185947" name="Picture 3"/>
             <wp:cNvGraphicFramePr>
               <a:graphicFrameLocks xmlns:a="http://schemas.openxmlformats.org/drawingml/2006/main" noChangeAspect="1"/>
             </wp:cNvGraphicFramePr>
@@ -1513,16 +1549,16 @@
               <a:graphicData uri="http://schemas.openxmlformats.org/drawingml/2006/picture">
                 <pic:pic xmlns:pic="http://schemas.openxmlformats.org/drawingml/2006/picture">
                   <pic:nvPicPr>
-                    <pic:cNvPr id="0" name="Picture 8"/>
+                    <pic:cNvPr id="0" name="Picture 3"/>
                     <pic:cNvPicPr>
                       <a:picLocks noChangeAspect="1" noChangeArrowheads="1"/>
                     </pic:cNvPicPr>
                   </pic:nvPicPr>
                   <pic:blipFill>
-                    <a:blip r:embed="rId10">
+                    <a:blip r:embed="rId10" cstate="print">
                       <a:extLst>
                         <a:ext uri="{28A0092B-C50C-407E-A947-70E740481C1C}">
-                          <a14:useLocalDpi xmlns:a14="http://schemas.microsoft.com/office/drawing/2010/main"/>
+                          <a14:useLocalDpi xmlns:a14="http://schemas.microsoft.com/office/drawing/2010/main" val="0"/>
                         </a:ext>
                       </a:extLst>
                     </a:blip>
@@ -1534,7 +1570,7 @@
                   <pic:spPr bwMode="auto">
                     <a:xfrm>
                       <a:off x="0" y="0"/>
-                      <a:ext cx="6114415" cy="3220085"/>
+                      <a:ext cx="6116982" cy="3823113"/>
                     </a:xfrm>
                     <a:prstGeom prst="rect">
                       <a:avLst/>
@@ -1543,13 +1579,6 @@
                     <a:ln>
                       <a:noFill/>
                     </a:ln>
-                    <a:effectLst>
-                      <a:outerShdw blurRad="50800" dist="38100" dir="5400000" algn="t" rotWithShape="0">
-                        <a:prstClr val="black">
-                          <a:alpha val="40000"/>
-                        </a:prstClr>
-                      </a:outerShdw>
-                    </a:effectLst>
                   </pic:spPr>
                 </pic:pic>
               </a:graphicData>
@@ -1557,24 +1586,16 @@
           </wp:inline>
         </w:drawing>
       </w:r>
-    </w:p>
-    <w:p>
-      <w:pPr>
-        <w:rPr>
-          <w:rFonts w:ascii="Verdana" w:hAnsi="Verdana"/>
-        </w:rPr>
-      </w:pPr>
       <w:r>
         <w:rPr>
           <w:rFonts w:ascii="Verdana" w:hAnsi="Verdana"/>
           <w:noProof/>
         </w:rPr>
-        <w:lastRenderedPageBreak/>
         <w:drawing>
-          <wp:inline distT="0" distB="0" distL="0" distR="0" wp14:anchorId="19170013" wp14:editId="226A9D17">
-            <wp:extent cx="6115685" cy="3218815"/>
-            <wp:effectExtent l="57150" t="19050" r="56515" b="95885"/>
-            <wp:docPr id="4" name="Picture 4"/>
+          <wp:inline distT="0" distB="0" distL="0" distR="0" wp14:anchorId="0C9DEC72" wp14:editId="2A4A4D08">
+            <wp:extent cx="6105525" cy="3815953"/>
+            <wp:effectExtent l="0" t="0" r="0" b="0"/>
+            <wp:docPr id="628856960" name="Picture 12"/>
             <wp:cNvGraphicFramePr>
               <a:graphicFrameLocks xmlns:a="http://schemas.openxmlformats.org/drawingml/2006/main" noChangeAspect="1"/>
             </wp:cNvGraphicFramePr>
@@ -1582,16 +1603,16 @@
               <a:graphicData uri="http://schemas.openxmlformats.org/drawingml/2006/picture">
                 <pic:pic xmlns:pic="http://schemas.openxmlformats.org/drawingml/2006/picture">
                   <pic:nvPicPr>
-                    <pic:cNvPr id="0" name="Picture 4"/>
+                    <pic:cNvPr id="0" name="Picture 21"/>
                     <pic:cNvPicPr>
                       <a:picLocks noChangeAspect="1" noChangeArrowheads="1"/>
                     </pic:cNvPicPr>
                   </pic:nvPicPr>
                   <pic:blipFill>
-                    <a:blip r:embed="rId11">
+                    <a:blip r:embed="rId11" cstate="print">
                       <a:extLst>
                         <a:ext uri="{28A0092B-C50C-407E-A947-70E740481C1C}">
-                          <a14:useLocalDpi xmlns:a14="http://schemas.microsoft.com/office/drawing/2010/main"/>
+                          <a14:useLocalDpi xmlns:a14="http://schemas.microsoft.com/office/drawing/2010/main" val="0"/>
                         </a:ext>
                       </a:extLst>
                     </a:blip>
@@ -1603,7 +1624,7 @@
                   <pic:spPr bwMode="auto">
                     <a:xfrm>
                       <a:off x="0" y="0"/>
-                      <a:ext cx="6115685" cy="3218815"/>
+                      <a:ext cx="6107960" cy="3817475"/>
                     </a:xfrm>
                     <a:prstGeom prst="rect">
                       <a:avLst/>
@@ -1612,13 +1633,6 @@
                     <a:ln>
                       <a:noFill/>
                     </a:ln>
-                    <a:effectLst>
-                      <a:outerShdw blurRad="50800" dist="38100" dir="5400000" algn="t" rotWithShape="0">
-                        <a:prstClr val="black">
-                          <a:alpha val="40000"/>
-                        </a:prstClr>
-                      </a:outerShdw>
-                    </a:effectLst>
                   </pic:spPr>
                 </pic:pic>
               </a:graphicData>
@@ -1626,78 +1640,23 @@
           </wp:inline>
         </w:drawing>
       </w:r>
+    </w:p>
+    <w:p>
+      <w:pPr>
+        <w:rPr>
+          <w:rFonts w:ascii="Verdana" w:hAnsi="Verdana"/>
+        </w:rPr>
+      </w:pPr>
       <w:r>
         <w:rPr>
           <w:rFonts w:ascii="Verdana" w:hAnsi="Verdana"/>
           <w:noProof/>
         </w:rPr>
         <w:drawing>
-          <wp:inline distT="0" distB="0" distL="0" distR="0" wp14:anchorId="6F193A11" wp14:editId="35D59FA7">
-            <wp:extent cx="6114415" cy="3220085"/>
-            <wp:effectExtent l="57150" t="19050" r="57785" b="94615"/>
-            <wp:docPr id="15" name="Picture 15"/>
-            <wp:cNvGraphicFramePr>
-              <a:graphicFrameLocks xmlns:a="http://schemas.openxmlformats.org/drawingml/2006/main" noChangeAspect="1"/>
-            </wp:cNvGraphicFramePr>
-            <a:graphic xmlns:a="http://schemas.openxmlformats.org/drawingml/2006/main">
-              <a:graphicData uri="http://schemas.openxmlformats.org/drawingml/2006/picture">
-                <pic:pic xmlns:pic="http://schemas.openxmlformats.org/drawingml/2006/picture">
-                  <pic:nvPicPr>
-                    <pic:cNvPr id="0" name="Picture 9"/>
-                    <pic:cNvPicPr>
-                      <a:picLocks noChangeAspect="1" noChangeArrowheads="1"/>
-                    </pic:cNvPicPr>
-                  </pic:nvPicPr>
-                  <pic:blipFill>
-                    <a:blip r:embed="rId12">
-                      <a:extLst>
-                        <a:ext uri="{28A0092B-C50C-407E-A947-70E740481C1C}">
-                          <a14:useLocalDpi xmlns:a14="http://schemas.microsoft.com/office/drawing/2010/main"/>
-                        </a:ext>
-                      </a:extLst>
-                    </a:blip>
-                    <a:srcRect/>
-                    <a:stretch>
-                      <a:fillRect/>
-                    </a:stretch>
-                  </pic:blipFill>
-                  <pic:spPr bwMode="auto">
-                    <a:xfrm>
-                      <a:off x="0" y="0"/>
-                      <a:ext cx="6114415" cy="3220085"/>
-                    </a:xfrm>
-                    <a:prstGeom prst="rect">
-                      <a:avLst/>
-                    </a:prstGeom>
-                    <a:noFill/>
-                    <a:ln>
-                      <a:noFill/>
-                    </a:ln>
-                    <a:effectLst>
-                      <a:outerShdw blurRad="50800" dist="38100" dir="5400000" algn="t" rotWithShape="0">
-                        <a:prstClr val="black">
-                          <a:alpha val="40000"/>
-                        </a:prstClr>
-                      </a:outerShdw>
-                    </a:effectLst>
-                  </pic:spPr>
-                </pic:pic>
-              </a:graphicData>
-            </a:graphic>
-          </wp:inline>
-        </w:drawing>
-      </w:r>
-      <w:r>
-        <w:rPr>
-          <w:rFonts w:ascii="Verdana" w:hAnsi="Verdana"/>
-          <w:noProof/>
-        </w:rPr>
-        <w:lastRenderedPageBreak/>
-        <w:drawing>
-          <wp:inline distT="0" distB="0" distL="0" distR="0" wp14:anchorId="5F5A9EB6" wp14:editId="32878C2D">
-            <wp:extent cx="6115685" cy="3218815"/>
-            <wp:effectExtent l="57150" t="19050" r="56515" b="95885"/>
-            <wp:docPr id="5" name="Picture 5"/>
+          <wp:inline distT="0" distB="0" distL="0" distR="0" wp14:anchorId="2F5F10F6" wp14:editId="5E6E5AE1">
+            <wp:extent cx="6171565" cy="3857228"/>
+            <wp:effectExtent l="0" t="0" r="635" b="0"/>
+            <wp:docPr id="2074802350" name="Picture 4"/>
             <wp:cNvGraphicFramePr>
               <a:graphicFrameLocks xmlns:a="http://schemas.openxmlformats.org/drawingml/2006/main" noChangeAspect="1"/>
             </wp:cNvGraphicFramePr>
@@ -1711,10 +1670,10 @@
                     </pic:cNvPicPr>
                   </pic:nvPicPr>
                   <pic:blipFill>
-                    <a:blip r:embed="rId13">
+                    <a:blip r:embed="rId12" cstate="print">
                       <a:extLst>
                         <a:ext uri="{28A0092B-C50C-407E-A947-70E740481C1C}">
-                          <a14:useLocalDpi xmlns:a14="http://schemas.microsoft.com/office/drawing/2010/main"/>
+                          <a14:useLocalDpi xmlns:a14="http://schemas.microsoft.com/office/drawing/2010/main" val="0"/>
                         </a:ext>
                       </a:extLst>
                     </a:blip>
@@ -1726,7 +1685,7 @@
                   <pic:spPr bwMode="auto">
                     <a:xfrm>
                       <a:off x="0" y="0"/>
-                      <a:ext cx="6115685" cy="3218815"/>
+                      <a:ext cx="6180594" cy="3862871"/>
                     </a:xfrm>
                     <a:prstGeom prst="rect">
                       <a:avLst/>
@@ -1735,13 +1694,6 @@
                     <a:ln>
                       <a:noFill/>
                     </a:ln>
-                    <a:effectLst>
-                      <a:outerShdw blurRad="50800" dist="38100" dir="5400000" algn="t" rotWithShape="0">
-                        <a:prstClr val="black">
-                          <a:alpha val="40000"/>
-                        </a:prstClr>
-                      </a:outerShdw>
-                    </a:effectLst>
                   </pic:spPr>
                 </pic:pic>
               </a:graphicData>
@@ -1755,10 +1707,10 @@
           <w:noProof/>
         </w:rPr>
         <w:drawing>
-          <wp:inline distT="0" distB="0" distL="0" distR="0" wp14:anchorId="15196EF2" wp14:editId="0BC1F02A">
-            <wp:extent cx="6114415" cy="3220085"/>
-            <wp:effectExtent l="57150" t="19050" r="57785" b="94615"/>
-            <wp:docPr id="16" name="Picture 16"/>
+          <wp:inline distT="0" distB="0" distL="0" distR="0" wp14:anchorId="0FEA65B8" wp14:editId="5C89B750">
+            <wp:extent cx="6187440" cy="3867150"/>
+            <wp:effectExtent l="0" t="0" r="3810" b="0"/>
+            <wp:docPr id="626487674" name="Picture 13"/>
             <wp:cNvGraphicFramePr>
               <a:graphicFrameLocks xmlns:a="http://schemas.openxmlformats.org/drawingml/2006/main" noChangeAspect="1"/>
             </wp:cNvGraphicFramePr>
@@ -1766,16 +1718,16 @@
               <a:graphicData uri="http://schemas.openxmlformats.org/drawingml/2006/picture">
                 <pic:pic xmlns:pic="http://schemas.openxmlformats.org/drawingml/2006/picture">
                   <pic:nvPicPr>
-                    <pic:cNvPr id="0" name="Picture 10"/>
+                    <pic:cNvPr id="0" name="Picture 23"/>
                     <pic:cNvPicPr>
                       <a:picLocks noChangeAspect="1" noChangeArrowheads="1"/>
                     </pic:cNvPicPr>
                   </pic:nvPicPr>
                   <pic:blipFill>
-                    <a:blip r:embed="rId14">
+                    <a:blip r:embed="rId13" cstate="print">
                       <a:extLst>
                         <a:ext uri="{28A0092B-C50C-407E-A947-70E740481C1C}">
-                          <a14:useLocalDpi xmlns:a14="http://schemas.microsoft.com/office/drawing/2010/main"/>
+                          <a14:useLocalDpi xmlns:a14="http://schemas.microsoft.com/office/drawing/2010/main" val="0"/>
                         </a:ext>
                       </a:extLst>
                     </a:blip>
@@ -1787,7 +1739,7 @@
                   <pic:spPr bwMode="auto">
                     <a:xfrm>
                       <a:off x="0" y="0"/>
-                      <a:ext cx="6114415" cy="3220085"/>
+                      <a:ext cx="6190877" cy="3869298"/>
                     </a:xfrm>
                     <a:prstGeom prst="rect">
                       <a:avLst/>
@@ -1796,13 +1748,6 @@
                     <a:ln>
                       <a:noFill/>
                     </a:ln>
-                    <a:effectLst>
-                      <a:outerShdw blurRad="50800" dist="38100" dir="5400000" algn="t" rotWithShape="0">
-                        <a:prstClr val="black">
-                          <a:alpha val="40000"/>
-                        </a:prstClr>
-                      </a:outerShdw>
-                    </a:effectLst>
                   </pic:spPr>
                 </pic:pic>
               </a:graphicData>
@@ -1810,63 +1755,16 @@
           </wp:inline>
         </w:drawing>
       </w:r>
-    </w:p>
-    <w:p>
-      <w:pPr>
-        <w:pStyle w:val="Heading2"/>
-        <w:rPr>
-          <w:rFonts w:ascii="Verdana" w:hAnsi="Verdana"/>
-        </w:rPr>
-      </w:pPr>
-      <w:r>
-        <w:rPr>
-          <w:rFonts w:ascii="Verdana" w:hAnsi="Verdana"/>
-        </w:rPr>
-        <w:br w:type="page"/>
-      </w:r>
-      <w:bookmarkStart w:id="9" w:name="_Toc223550822"/>
-      <w:bookmarkStart w:id="10" w:name="_Toc223632444"/>
-      <w:r>
-        <w:rPr>
-          <w:rFonts w:ascii="Verdana" w:hAnsi="Verdana"/>
-        </w:rPr>
-        <w:lastRenderedPageBreak/>
-        <w:t>Portrait screen shot</w:t>
-      </w:r>
-      <w:r>
-        <w:rPr>
-          <w:rFonts w:ascii="Verdana" w:hAnsi="Verdana"/>
-          <w:lang w:val="en-DK"/>
-        </w:rPr>
-        <w:t>s</w:t>
-      </w:r>
-      <w:r>
-        <w:rPr>
-          <w:rFonts w:ascii="Verdana" w:hAnsi="Verdana"/>
-        </w:rPr>
-        <w:t>.</w:t>
-      </w:r>
-      <w:bookmarkStart w:id="11" w:name="_Toc78485144"/>
-      <w:bookmarkEnd w:id="9"/>
-      <w:bookmarkEnd w:id="10"/>
-    </w:p>
-    <w:p>
-      <w:pPr>
-        <w:rPr>
-          <w:rFonts w:ascii="Verdana" w:hAnsi="Verdana"/>
-        </w:rPr>
-      </w:pPr>
       <w:r>
         <w:rPr>
           <w:rFonts w:ascii="Verdana" w:hAnsi="Verdana"/>
           <w:noProof/>
         </w:rPr>
-        <w:lastRenderedPageBreak/>
         <w:drawing>
-          <wp:inline distT="0" distB="0" distL="0" distR="0" wp14:anchorId="0DC28352" wp14:editId="49B4DB04">
-            <wp:extent cx="3933825" cy="8524875"/>
-            <wp:effectExtent l="0" t="0" r="9525" b="9525"/>
-            <wp:docPr id="736696348" name="Picture 4"/>
+          <wp:inline distT="0" distB="0" distL="0" distR="0" wp14:anchorId="499F17DB" wp14:editId="583529D1">
+            <wp:extent cx="6171565" cy="3857228"/>
+            <wp:effectExtent l="0" t="0" r="635" b="0"/>
+            <wp:docPr id="184061096" name="Picture 5"/>
             <wp:cNvGraphicFramePr>
               <a:graphicFrameLocks xmlns:a="http://schemas.openxmlformats.org/drawingml/2006/main" noChangeAspect="1"/>
             </wp:cNvGraphicFramePr>
@@ -1874,7 +1772,61 @@
               <a:graphicData uri="http://schemas.openxmlformats.org/drawingml/2006/picture">
                 <pic:pic xmlns:pic="http://schemas.openxmlformats.org/drawingml/2006/picture">
                   <pic:nvPicPr>
-                    <pic:cNvPr id="0" name="Picture 4"/>
+                    <pic:cNvPr id="0" name="Picture 7"/>
+                    <pic:cNvPicPr>
+                      <a:picLocks noChangeAspect="1" noChangeArrowheads="1"/>
+                    </pic:cNvPicPr>
+                  </pic:nvPicPr>
+                  <pic:blipFill>
+                    <a:blip r:embed="rId14" cstate="print">
+                      <a:extLst>
+                        <a:ext uri="{28A0092B-C50C-407E-A947-70E740481C1C}">
+                          <a14:useLocalDpi xmlns:a14="http://schemas.microsoft.com/office/drawing/2010/main" val="0"/>
+                        </a:ext>
+                      </a:extLst>
+                    </a:blip>
+                    <a:srcRect/>
+                    <a:stretch>
+                      <a:fillRect/>
+                    </a:stretch>
+                  </pic:blipFill>
+                  <pic:spPr bwMode="auto">
+                    <a:xfrm>
+                      <a:off x="0" y="0"/>
+                      <a:ext cx="6175212" cy="3859507"/>
+                    </a:xfrm>
+                    <a:prstGeom prst="rect">
+                      <a:avLst/>
+                    </a:prstGeom>
+                    <a:noFill/>
+                    <a:ln>
+                      <a:noFill/>
+                    </a:ln>
+                  </pic:spPr>
+                </pic:pic>
+              </a:graphicData>
+            </a:graphic>
+          </wp:inline>
+        </w:drawing>
+      </w:r>
+      <w:r>
+        <w:rPr>
+          <w:rFonts w:ascii="Verdana" w:hAnsi="Verdana"/>
+          <w:noProof/>
+        </w:rPr>
+        <w:drawing>
+          <wp:inline distT="0" distB="0" distL="0" distR="0" wp14:anchorId="54CBF405" wp14:editId="653FD2E0">
+            <wp:extent cx="6187440" cy="3867150"/>
+            <wp:effectExtent l="0" t="0" r="3810" b="0"/>
+            <wp:docPr id="445324726" name="Picture 14"/>
+            <wp:cNvGraphicFramePr>
+              <a:graphicFrameLocks xmlns:a="http://schemas.openxmlformats.org/drawingml/2006/main" noChangeAspect="1"/>
+            </wp:cNvGraphicFramePr>
+            <a:graphic xmlns:a="http://schemas.openxmlformats.org/drawingml/2006/main">
+              <a:graphicData uri="http://schemas.openxmlformats.org/drawingml/2006/picture">
+                <pic:pic xmlns:pic="http://schemas.openxmlformats.org/drawingml/2006/picture">
+                  <pic:nvPicPr>
+                    <pic:cNvPr id="0" name="Picture 25"/>
                     <pic:cNvPicPr>
                       <a:picLocks noChangeAspect="1" noChangeArrowheads="1"/>
                     </pic:cNvPicPr>
@@ -1895,7 +1847,7 @@
                   <pic:spPr bwMode="auto">
                     <a:xfrm>
                       <a:off x="0" y="0"/>
-                      <a:ext cx="3933825" cy="8524875"/>
+                      <a:ext cx="6187440" cy="3867150"/>
                     </a:xfrm>
                     <a:prstGeom prst="rect">
                       <a:avLst/>
@@ -1916,12 +1868,11 @@
           <w:rFonts w:ascii="Verdana" w:hAnsi="Verdana"/>
           <w:noProof/>
         </w:rPr>
-        <w:lastRenderedPageBreak/>
         <w:drawing>
-          <wp:inline distT="0" distB="0" distL="0" distR="0" wp14:anchorId="51BDBD1F" wp14:editId="533C41CB">
-            <wp:extent cx="3933825" cy="8524875"/>
-            <wp:effectExtent l="0" t="0" r="9525" b="9525"/>
-            <wp:docPr id="481160559" name="Picture 5"/>
+          <wp:inline distT="0" distB="0" distL="0" distR="0" wp14:anchorId="2E40DAC1" wp14:editId="03E6B522">
+            <wp:extent cx="6263640" cy="3914775"/>
+            <wp:effectExtent l="0" t="0" r="3810" b="9525"/>
+            <wp:docPr id="540793567" name="Picture 6"/>
             <wp:cNvGraphicFramePr>
               <a:graphicFrameLocks xmlns:a="http://schemas.openxmlformats.org/drawingml/2006/main" noChangeAspect="1"/>
             </wp:cNvGraphicFramePr>
@@ -1929,7 +1880,7 @@
               <a:graphicData uri="http://schemas.openxmlformats.org/drawingml/2006/picture">
                 <pic:pic xmlns:pic="http://schemas.openxmlformats.org/drawingml/2006/picture">
                   <pic:nvPicPr>
-                    <pic:cNvPr id="0" name="Picture 5"/>
+                    <pic:cNvPr id="0" name="Picture 9"/>
                     <pic:cNvPicPr>
                       <a:picLocks noChangeAspect="1" noChangeArrowheads="1"/>
                     </pic:cNvPicPr>
@@ -1950,7 +1901,7 @@
                   <pic:spPr bwMode="auto">
                     <a:xfrm>
                       <a:off x="0" y="0"/>
-                      <a:ext cx="3933825" cy="8524875"/>
+                      <a:ext cx="6263640" cy="3914775"/>
                     </a:xfrm>
                     <a:prstGeom prst="rect">
                       <a:avLst/>
@@ -1971,12 +1922,218 @@
           <w:rFonts w:ascii="Verdana" w:hAnsi="Verdana"/>
           <w:noProof/>
         </w:rPr>
-        <w:lastRenderedPageBreak/>
         <w:drawing>
-          <wp:inline distT="0" distB="0" distL="0" distR="0" wp14:anchorId="4D30117B" wp14:editId="481B7ED0">
-            <wp:extent cx="3935730" cy="8523605"/>
-            <wp:effectExtent l="57150" t="19050" r="64770" b="86995"/>
-            <wp:docPr id="19" name="Picture 19"/>
+          <wp:inline distT="0" distB="0" distL="0" distR="0" wp14:anchorId="13C10AE1" wp14:editId="21200A82">
+            <wp:extent cx="6334125" cy="3958828"/>
+            <wp:effectExtent l="0" t="0" r="0" b="3810"/>
+            <wp:docPr id="1164576225" name="Picture 15"/>
+            <wp:cNvGraphicFramePr>
+              <a:graphicFrameLocks xmlns:a="http://schemas.openxmlformats.org/drawingml/2006/main" noChangeAspect="1"/>
+            </wp:cNvGraphicFramePr>
+            <a:graphic xmlns:a="http://schemas.openxmlformats.org/drawingml/2006/main">
+              <a:graphicData uri="http://schemas.openxmlformats.org/drawingml/2006/picture">
+                <pic:pic xmlns:pic="http://schemas.openxmlformats.org/drawingml/2006/picture">
+                  <pic:nvPicPr>
+                    <pic:cNvPr id="0" name="Picture 27"/>
+                    <pic:cNvPicPr>
+                      <a:picLocks noChangeAspect="1" noChangeArrowheads="1"/>
+                    </pic:cNvPicPr>
+                  </pic:nvPicPr>
+                  <pic:blipFill>
+                    <a:blip r:embed="rId17" cstate="print">
+                      <a:extLst>
+                        <a:ext uri="{28A0092B-C50C-407E-A947-70E740481C1C}">
+                          <a14:useLocalDpi xmlns:a14="http://schemas.microsoft.com/office/drawing/2010/main" val="0"/>
+                        </a:ext>
+                      </a:extLst>
+                    </a:blip>
+                    <a:srcRect/>
+                    <a:stretch>
+                      <a:fillRect/>
+                    </a:stretch>
+                  </pic:blipFill>
+                  <pic:spPr bwMode="auto">
+                    <a:xfrm>
+                      <a:off x="0" y="0"/>
+                      <a:ext cx="6339506" cy="3962191"/>
+                    </a:xfrm>
+                    <a:prstGeom prst="rect">
+                      <a:avLst/>
+                    </a:prstGeom>
+                    <a:noFill/>
+                    <a:ln>
+                      <a:noFill/>
+                    </a:ln>
+                  </pic:spPr>
+                </pic:pic>
+              </a:graphicData>
+            </a:graphic>
+          </wp:inline>
+        </w:drawing>
+      </w:r>
+    </w:p>
+    <w:p>
+      <w:pPr>
+        <w:pStyle w:val="Heading2"/>
+        <w:rPr>
+          <w:rFonts w:ascii="Verdana" w:hAnsi="Verdana"/>
+        </w:rPr>
+      </w:pPr>
+      <w:r>
+        <w:rPr>
+          <w:rFonts w:ascii="Verdana" w:hAnsi="Verdana"/>
+        </w:rPr>
+        <w:br w:type="page"/>
+      </w:r>
+      <w:bookmarkStart w:id="9" w:name="_Toc223550822"/>
+      <w:bookmarkStart w:id="10" w:name="_Toc223636905"/>
+      <w:r>
+        <w:rPr>
+          <w:rFonts w:ascii="Verdana" w:hAnsi="Verdana"/>
+        </w:rPr>
+        <w:t>Portrait screen shot</w:t>
+      </w:r>
+      <w:r>
+        <w:rPr>
+          <w:rFonts w:ascii="Verdana" w:hAnsi="Verdana"/>
+          <w:lang w:val="en-DK"/>
+        </w:rPr>
+        <w:t>s</w:t>
+      </w:r>
+      <w:r>
+        <w:rPr>
+          <w:rFonts w:ascii="Verdana" w:hAnsi="Verdana"/>
+        </w:rPr>
+        <w:t>.</w:t>
+      </w:r>
+      <w:bookmarkStart w:id="11" w:name="_Toc78485144"/>
+      <w:bookmarkEnd w:id="9"/>
+      <w:bookmarkEnd w:id="10"/>
+    </w:p>
+    <w:p>
+      <w:pPr>
+        <w:rPr>
+          <w:rFonts w:ascii="Verdana" w:hAnsi="Verdana"/>
+        </w:rPr>
+      </w:pPr>
+      <w:r>
+        <w:rPr>
+          <w:rFonts w:ascii="Verdana" w:hAnsi="Verdana"/>
+          <w:noProof/>
+        </w:rPr>
+        <w:drawing>
+          <wp:inline distT="0" distB="0" distL="0" distR="0" wp14:anchorId="0BF37F83" wp14:editId="79D8C485">
+            <wp:extent cx="3702844" cy="5924550"/>
+            <wp:effectExtent l="0" t="0" r="0" b="0"/>
+            <wp:docPr id="570210423" name="Picture 7"/>
+            <wp:cNvGraphicFramePr>
+              <a:graphicFrameLocks xmlns:a="http://schemas.openxmlformats.org/drawingml/2006/main" noChangeAspect="1"/>
+            </wp:cNvGraphicFramePr>
+            <a:graphic xmlns:a="http://schemas.openxmlformats.org/drawingml/2006/main">
+              <a:graphicData uri="http://schemas.openxmlformats.org/drawingml/2006/picture">
+                <pic:pic xmlns:pic="http://schemas.openxmlformats.org/drawingml/2006/picture">
+                  <pic:nvPicPr>
+                    <pic:cNvPr id="0" name="Picture 11"/>
+                    <pic:cNvPicPr>
+                      <a:picLocks noChangeAspect="1" noChangeArrowheads="1"/>
+                    </pic:cNvPicPr>
+                  </pic:nvPicPr>
+                  <pic:blipFill>
+                    <a:blip r:embed="rId18" cstate="print">
+                      <a:extLst>
+                        <a:ext uri="{28A0092B-C50C-407E-A947-70E740481C1C}">
+                          <a14:useLocalDpi xmlns:a14="http://schemas.microsoft.com/office/drawing/2010/main" val="0"/>
+                        </a:ext>
+                      </a:extLst>
+                    </a:blip>
+                    <a:srcRect/>
+                    <a:stretch>
+                      <a:fillRect/>
+                    </a:stretch>
+                  </pic:blipFill>
+                  <pic:spPr bwMode="auto">
+                    <a:xfrm>
+                      <a:off x="0" y="0"/>
+                      <a:ext cx="3721559" cy="5954494"/>
+                    </a:xfrm>
+                    <a:prstGeom prst="rect">
+                      <a:avLst/>
+                    </a:prstGeom>
+                    <a:noFill/>
+                    <a:ln>
+                      <a:noFill/>
+                    </a:ln>
+                  </pic:spPr>
+                </pic:pic>
+              </a:graphicData>
+            </a:graphic>
+          </wp:inline>
+        </w:drawing>
+      </w:r>
+      <w:r>
+        <w:rPr>
+          <w:rFonts w:ascii="Verdana" w:hAnsi="Verdana"/>
+          <w:noProof/>
+        </w:rPr>
+        <w:drawing>
+          <wp:inline distT="0" distB="0" distL="0" distR="0" wp14:anchorId="78BDE107" wp14:editId="652FF2AC">
+            <wp:extent cx="4006453" cy="6410325"/>
+            <wp:effectExtent l="0" t="0" r="0" b="0"/>
+            <wp:docPr id="1657734869" name="Picture 16"/>
+            <wp:cNvGraphicFramePr>
+              <a:graphicFrameLocks xmlns:a="http://schemas.openxmlformats.org/drawingml/2006/main" noChangeAspect="1"/>
+            </wp:cNvGraphicFramePr>
+            <a:graphic xmlns:a="http://schemas.openxmlformats.org/drawingml/2006/main">
+              <a:graphicData uri="http://schemas.openxmlformats.org/drawingml/2006/picture">
+                <pic:pic xmlns:pic="http://schemas.openxmlformats.org/drawingml/2006/picture">
+                  <pic:nvPicPr>
+                    <pic:cNvPr id="0" name="Picture 29"/>
+                    <pic:cNvPicPr>
+                      <a:picLocks noChangeAspect="1" noChangeArrowheads="1"/>
+                    </pic:cNvPicPr>
+                  </pic:nvPicPr>
+                  <pic:blipFill>
+                    <a:blip r:embed="rId19" cstate="print">
+                      <a:extLst>
+                        <a:ext uri="{28A0092B-C50C-407E-A947-70E740481C1C}">
+                          <a14:useLocalDpi xmlns:a14="http://schemas.microsoft.com/office/drawing/2010/main" val="0"/>
+                        </a:ext>
+                      </a:extLst>
+                    </a:blip>
+                    <a:srcRect/>
+                    <a:stretch>
+                      <a:fillRect/>
+                    </a:stretch>
+                  </pic:blipFill>
+                  <pic:spPr bwMode="auto">
+                    <a:xfrm>
+                      <a:off x="0" y="0"/>
+                      <a:ext cx="4024468" cy="6439149"/>
+                    </a:xfrm>
+                    <a:prstGeom prst="rect">
+                      <a:avLst/>
+                    </a:prstGeom>
+                    <a:noFill/>
+                    <a:ln>
+                      <a:noFill/>
+                    </a:ln>
+                  </pic:spPr>
+                </pic:pic>
+              </a:graphicData>
+            </a:graphic>
+          </wp:inline>
+        </w:drawing>
+      </w:r>
+      <w:r>
+        <w:rPr>
+          <w:rFonts w:ascii="Verdana" w:hAnsi="Verdana"/>
+          <w:noProof/>
+        </w:rPr>
+        <w:drawing>
+          <wp:inline distT="0" distB="0" distL="0" distR="0" wp14:anchorId="19D5E2DA" wp14:editId="3A5351FF">
+            <wp:extent cx="3833813" cy="6134100"/>
+            <wp:effectExtent l="0" t="0" r="0" b="0"/>
+            <wp:docPr id="345669618" name="Picture 8"/>
             <wp:cNvGraphicFramePr>
               <a:graphicFrameLocks xmlns:a="http://schemas.openxmlformats.org/drawingml/2006/main" noChangeAspect="1"/>
             </wp:cNvGraphicFramePr>
@@ -1990,10 +2147,10 @@
                     </pic:cNvPicPr>
                   </pic:nvPicPr>
                   <pic:blipFill>
-                    <a:blip r:embed="rId17" cstate="screen">
+                    <a:blip r:embed="rId20" cstate="print">
                       <a:extLst>
                         <a:ext uri="{28A0092B-C50C-407E-A947-70E740481C1C}">
-                          <a14:useLocalDpi xmlns:a14="http://schemas.microsoft.com/office/drawing/2010/main"/>
+                          <a14:useLocalDpi xmlns:a14="http://schemas.microsoft.com/office/drawing/2010/main" val="0"/>
                         </a:ext>
                       </a:extLst>
                     </a:blip>
@@ -2005,7 +2162,7 @@
                   <pic:spPr bwMode="auto">
                     <a:xfrm>
                       <a:off x="0" y="0"/>
-                      <a:ext cx="3935730" cy="8523605"/>
+                      <a:ext cx="3843194" cy="6149109"/>
                     </a:xfrm>
                     <a:prstGeom prst="rect">
                       <a:avLst/>
@@ -2014,13 +2171,6 @@
                     <a:ln>
                       <a:noFill/>
                     </a:ln>
-                    <a:effectLst>
-                      <a:outerShdw blurRad="50800" dist="38100" dir="5400000" algn="t" rotWithShape="0">
-                        <a:prstClr val="black">
-                          <a:alpha val="40000"/>
-                        </a:prstClr>
-                      </a:outerShdw>
-                    </a:effectLst>
                   </pic:spPr>
                 </pic:pic>
               </a:graphicData>
@@ -2033,12 +2183,11 @@
           <w:rFonts w:ascii="Verdana" w:hAnsi="Verdana"/>
           <w:noProof/>
         </w:rPr>
-        <w:lastRenderedPageBreak/>
         <w:drawing>
-          <wp:inline distT="0" distB="0" distL="0" distR="0" wp14:anchorId="61DCD750" wp14:editId="703D0B86">
-            <wp:extent cx="3935730" cy="8523605"/>
-            <wp:effectExtent l="57150" t="19050" r="64770" b="86995"/>
-            <wp:docPr id="20" name="Picture 20"/>
+          <wp:inline distT="0" distB="0" distL="0" distR="0" wp14:anchorId="243508F7" wp14:editId="06EDA06C">
+            <wp:extent cx="3833812" cy="6134100"/>
+            <wp:effectExtent l="0" t="0" r="0" b="0"/>
+            <wp:docPr id="423152048" name="Picture 18"/>
             <wp:cNvGraphicFramePr>
               <a:graphicFrameLocks xmlns:a="http://schemas.openxmlformats.org/drawingml/2006/main" noChangeAspect="1"/>
             </wp:cNvGraphicFramePr>
@@ -2046,16 +2195,16 @@
               <a:graphicData uri="http://schemas.openxmlformats.org/drawingml/2006/picture">
                 <pic:pic xmlns:pic="http://schemas.openxmlformats.org/drawingml/2006/picture">
                   <pic:nvPicPr>
-                    <pic:cNvPr id="0" name="Picture 14"/>
+                    <pic:cNvPr id="0" name="Picture 33"/>
                     <pic:cNvPicPr>
                       <a:picLocks noChangeAspect="1" noChangeArrowheads="1"/>
                     </pic:cNvPicPr>
                   </pic:nvPicPr>
                   <pic:blipFill>
-                    <a:blip r:embed="rId18" cstate="screen">
+                    <a:blip r:embed="rId21" cstate="print">
                       <a:extLst>
                         <a:ext uri="{28A0092B-C50C-407E-A947-70E740481C1C}">
-                          <a14:useLocalDpi xmlns:a14="http://schemas.microsoft.com/office/drawing/2010/main"/>
+                          <a14:useLocalDpi xmlns:a14="http://schemas.microsoft.com/office/drawing/2010/main" val="0"/>
                         </a:ext>
                       </a:extLst>
                     </a:blip>
@@ -2067,7 +2216,7 @@
                   <pic:spPr bwMode="auto">
                     <a:xfrm>
                       <a:off x="0" y="0"/>
-                      <a:ext cx="3935730" cy="8523605"/>
+                      <a:ext cx="3843345" cy="6149352"/>
                     </a:xfrm>
                     <a:prstGeom prst="rect">
                       <a:avLst/>
@@ -2076,13 +2225,6 @@
                     <a:ln>
                       <a:noFill/>
                     </a:ln>
-                    <a:effectLst>
-                      <a:outerShdw blurRad="50800" dist="38100" dir="5400000" algn="t" rotWithShape="0">
-                        <a:prstClr val="black">
-                          <a:alpha val="40000"/>
-                        </a:prstClr>
-                      </a:outerShdw>
-                    </a:effectLst>
                   </pic:spPr>
                 </pic:pic>
               </a:graphicData>
@@ -2095,12 +2237,11 @@
           <w:rFonts w:ascii="Verdana" w:hAnsi="Verdana"/>
           <w:noProof/>
         </w:rPr>
-        <w:lastRenderedPageBreak/>
         <w:drawing>
-          <wp:inline distT="0" distB="0" distL="0" distR="0" wp14:anchorId="70F0105C" wp14:editId="44B07CDA">
-            <wp:extent cx="3935730" cy="8523605"/>
-            <wp:effectExtent l="57150" t="19050" r="64770" b="86995"/>
-            <wp:docPr id="21" name="Picture 21"/>
+          <wp:inline distT="0" distB="0" distL="0" distR="0" wp14:anchorId="2B697446" wp14:editId="75C21F2E">
+            <wp:extent cx="3744516" cy="5991225"/>
+            <wp:effectExtent l="0" t="0" r="8890" b="0"/>
+            <wp:docPr id="1898953343" name="Picture 9"/>
             <wp:cNvGraphicFramePr>
               <a:graphicFrameLocks xmlns:a="http://schemas.openxmlformats.org/drawingml/2006/main" noChangeAspect="1"/>
             </wp:cNvGraphicFramePr>
@@ -2114,10 +2255,10 @@
                     </pic:cNvPicPr>
                   </pic:nvPicPr>
                   <pic:blipFill>
-                    <a:blip r:embed="rId19" cstate="screen">
+                    <a:blip r:embed="rId22" cstate="print">
                       <a:extLst>
                         <a:ext uri="{28A0092B-C50C-407E-A947-70E740481C1C}">
-                          <a14:useLocalDpi xmlns:a14="http://schemas.microsoft.com/office/drawing/2010/main"/>
+                          <a14:useLocalDpi xmlns:a14="http://schemas.microsoft.com/office/drawing/2010/main" val="0"/>
                         </a:ext>
                       </a:extLst>
                     </a:blip>
@@ -2129,7 +2270,7 @@
                   <pic:spPr bwMode="auto">
                     <a:xfrm>
                       <a:off x="0" y="0"/>
-                      <a:ext cx="3935730" cy="8523605"/>
+                      <a:ext cx="3766648" cy="6026637"/>
                     </a:xfrm>
                     <a:prstGeom prst="rect">
                       <a:avLst/>
@@ -2138,13 +2279,6 @@
                     <a:ln>
                       <a:noFill/>
                     </a:ln>
-                    <a:effectLst>
-                      <a:outerShdw blurRad="50800" dist="38100" dir="5400000" algn="t" rotWithShape="0">
-                        <a:prstClr val="black">
-                          <a:alpha val="40000"/>
-                        </a:prstClr>
-                      </a:outerShdw>
-                    </a:effectLst>
                   </pic:spPr>
                 </pic:pic>
               </a:graphicData>
@@ -2157,12 +2291,11 @@
           <w:rFonts w:ascii="Verdana" w:hAnsi="Verdana"/>
           <w:noProof/>
         </w:rPr>
-        <w:lastRenderedPageBreak/>
         <w:drawing>
-          <wp:inline distT="0" distB="0" distL="0" distR="0" wp14:anchorId="41B29288" wp14:editId="7AAC555A">
-            <wp:extent cx="3935730" cy="8523605"/>
-            <wp:effectExtent l="57150" t="19050" r="64770" b="86995"/>
-            <wp:docPr id="22" name="Picture 22"/>
+          <wp:inline distT="0" distB="0" distL="0" distR="0" wp14:anchorId="459C693F" wp14:editId="616BFD9F">
+            <wp:extent cx="3714751" cy="5943600"/>
+            <wp:effectExtent l="0" t="0" r="0" b="0"/>
+            <wp:docPr id="1080861607" name="Picture 19"/>
             <wp:cNvGraphicFramePr>
               <a:graphicFrameLocks xmlns:a="http://schemas.openxmlformats.org/drawingml/2006/main" noChangeAspect="1"/>
             </wp:cNvGraphicFramePr>
@@ -2170,16 +2303,16 @@
               <a:graphicData uri="http://schemas.openxmlformats.org/drawingml/2006/picture">
                 <pic:pic xmlns:pic="http://schemas.openxmlformats.org/drawingml/2006/picture">
                   <pic:nvPicPr>
-                    <pic:cNvPr id="0" name="Picture 16"/>
+                    <pic:cNvPr id="0" name="Picture 35"/>
                     <pic:cNvPicPr>
                       <a:picLocks noChangeAspect="1" noChangeArrowheads="1"/>
                     </pic:cNvPicPr>
                   </pic:nvPicPr>
                   <pic:blipFill>
-                    <a:blip r:embed="rId20" cstate="screen">
+                    <a:blip r:embed="rId23" cstate="print">
                       <a:extLst>
                         <a:ext uri="{28A0092B-C50C-407E-A947-70E740481C1C}">
-                          <a14:useLocalDpi xmlns:a14="http://schemas.microsoft.com/office/drawing/2010/main"/>
+                          <a14:useLocalDpi xmlns:a14="http://schemas.microsoft.com/office/drawing/2010/main" val="0"/>
                         </a:ext>
                       </a:extLst>
                     </a:blip>
@@ -2191,7 +2324,7 @@
                   <pic:spPr bwMode="auto">
                     <a:xfrm>
                       <a:off x="0" y="0"/>
-                      <a:ext cx="3935730" cy="8523605"/>
+                      <a:ext cx="3725946" cy="5961512"/>
                     </a:xfrm>
                     <a:prstGeom prst="rect">
                       <a:avLst/>
@@ -2200,13 +2333,6 @@
                     <a:ln>
                       <a:noFill/>
                     </a:ln>
-                    <a:effectLst>
-                      <a:outerShdw blurRad="50800" dist="38100" dir="5400000" algn="t" rotWithShape="0">
-                        <a:prstClr val="black">
-                          <a:alpha val="40000"/>
-                        </a:prstClr>
-                      </a:outerShdw>
-                    </a:effectLst>
                   </pic:spPr>
                 </pic:pic>
               </a:graphicData>
@@ -2219,12 +2345,11 @@
           <w:rFonts w:ascii="Verdana" w:hAnsi="Verdana"/>
           <w:noProof/>
         </w:rPr>
-        <w:lastRenderedPageBreak/>
         <w:drawing>
-          <wp:inline distT="0" distB="0" distL="0" distR="0" wp14:anchorId="405357C1" wp14:editId="585A5CE8">
-            <wp:extent cx="3935730" cy="8523605"/>
-            <wp:effectExtent l="57150" t="19050" r="64770" b="86995"/>
-            <wp:docPr id="23" name="Picture 23"/>
+          <wp:inline distT="0" distB="0" distL="0" distR="0" wp14:anchorId="20CC39F4" wp14:editId="6B2EAC75">
+            <wp:extent cx="3839766" cy="6143625"/>
+            <wp:effectExtent l="0" t="0" r="8890" b="0"/>
+            <wp:docPr id="483172032" name="Picture 10"/>
             <wp:cNvGraphicFramePr>
               <a:graphicFrameLocks xmlns:a="http://schemas.openxmlformats.org/drawingml/2006/main" noChangeAspect="1"/>
             </wp:cNvGraphicFramePr>
@@ -2238,10 +2363,10 @@
                     </pic:cNvPicPr>
                   </pic:nvPicPr>
                   <pic:blipFill>
-                    <a:blip r:embed="rId21" cstate="screen">
+                    <a:blip r:embed="rId24" cstate="print">
                       <a:extLst>
                         <a:ext uri="{28A0092B-C50C-407E-A947-70E740481C1C}">
-                          <a14:useLocalDpi xmlns:a14="http://schemas.microsoft.com/office/drawing/2010/main"/>
+                          <a14:useLocalDpi xmlns:a14="http://schemas.microsoft.com/office/drawing/2010/main" val="0"/>
                         </a:ext>
                       </a:extLst>
                     </a:blip>
@@ -2253,7 +2378,7 @@
                   <pic:spPr bwMode="auto">
                     <a:xfrm>
                       <a:off x="0" y="0"/>
-                      <a:ext cx="3935730" cy="8523605"/>
+                      <a:ext cx="3846510" cy="6154415"/>
                     </a:xfrm>
                     <a:prstGeom prst="rect">
                       <a:avLst/>
@@ -2262,13 +2387,6 @@
                     <a:ln>
                       <a:noFill/>
                     </a:ln>
-                    <a:effectLst>
-                      <a:outerShdw blurRad="50800" dist="38100" dir="5400000" algn="t" rotWithShape="0">
-                        <a:prstClr val="black">
-                          <a:alpha val="40000"/>
-                        </a:prstClr>
-                      </a:outerShdw>
-                    </a:effectLst>
                   </pic:spPr>
                 </pic:pic>
               </a:graphicData>
@@ -2276,17 +2394,17 @@
           </wp:inline>
         </w:drawing>
       </w:r>
+      <w:bookmarkEnd w:id="11"/>
       <w:r>
         <w:rPr>
           <w:rFonts w:ascii="Verdana" w:hAnsi="Verdana"/>
           <w:noProof/>
         </w:rPr>
-        <w:lastRenderedPageBreak/>
         <w:drawing>
-          <wp:inline distT="0" distB="0" distL="0" distR="0" wp14:anchorId="1DAB094C" wp14:editId="45907A5B">
-            <wp:extent cx="3935730" cy="8523605"/>
-            <wp:effectExtent l="57150" t="19050" r="64770" b="86995"/>
-            <wp:docPr id="24" name="Picture 24"/>
+          <wp:inline distT="0" distB="0" distL="0" distR="0" wp14:anchorId="29CCD64A" wp14:editId="11BED7DD">
+            <wp:extent cx="3851672" cy="6162675"/>
+            <wp:effectExtent l="0" t="0" r="0" b="0"/>
+            <wp:docPr id="220091457" name="Picture 20"/>
             <wp:cNvGraphicFramePr>
               <a:graphicFrameLocks xmlns:a="http://schemas.openxmlformats.org/drawingml/2006/main" noChangeAspect="1"/>
             </wp:cNvGraphicFramePr>
@@ -2294,16 +2412,16 @@
               <a:graphicData uri="http://schemas.openxmlformats.org/drawingml/2006/picture">
                 <pic:pic xmlns:pic="http://schemas.openxmlformats.org/drawingml/2006/picture">
                   <pic:nvPicPr>
-                    <pic:cNvPr id="0" name="Picture 18"/>
+                    <pic:cNvPr id="0" name="Picture 37"/>
                     <pic:cNvPicPr>
                       <a:picLocks noChangeAspect="1" noChangeArrowheads="1"/>
                     </pic:cNvPicPr>
                   </pic:nvPicPr>
                   <pic:blipFill>
-                    <a:blip r:embed="rId22" cstate="screen">
+                    <a:blip r:embed="rId25" cstate="print">
                       <a:extLst>
                         <a:ext uri="{28A0092B-C50C-407E-A947-70E740481C1C}">
-                          <a14:useLocalDpi xmlns:a14="http://schemas.microsoft.com/office/drawing/2010/main"/>
+                          <a14:useLocalDpi xmlns:a14="http://schemas.microsoft.com/office/drawing/2010/main" val="0"/>
                         </a:ext>
                       </a:extLst>
                     </a:blip>
@@ -2315,7 +2433,7 @@
                   <pic:spPr bwMode="auto">
                     <a:xfrm>
                       <a:off x="0" y="0"/>
-                      <a:ext cx="3935730" cy="8523605"/>
+                      <a:ext cx="3856220" cy="6169953"/>
                     </a:xfrm>
                     <a:prstGeom prst="rect">
                       <a:avLst/>
@@ -2324,13 +2442,6 @@
                     <a:ln>
                       <a:noFill/>
                     </a:ln>
-                    <a:effectLst>
-                      <a:outerShdw blurRad="50800" dist="38100" dir="5400000" algn="t" rotWithShape="0">
-                        <a:prstClr val="black">
-                          <a:alpha val="40000"/>
-                        </a:prstClr>
-                      </a:outerShdw>
-                    </a:effectLst>
                   </pic:spPr>
                 </pic:pic>
               </a:graphicData>
@@ -2338,7 +2449,6 @@
           </wp:inline>
         </w:drawing>
       </w:r>
-      <w:bookmarkEnd w:id="11"/>
     </w:p>
     <w:p>
       <w:pPr>
@@ -2352,6 +2462,114 @@
         </w:rPr>
         <w:br w:type="page"/>
       </w:r>
+      <w:r>
+        <w:rPr>
+          <w:rFonts w:ascii="Verdana" w:hAnsi="Verdana"/>
+          <w:noProof/>
+        </w:rPr>
+        <w:drawing>
+          <wp:inline distT="0" distB="0" distL="0" distR="0" wp14:anchorId="11B76EB8" wp14:editId="7399B115">
+            <wp:extent cx="4036219" cy="6457950"/>
+            <wp:effectExtent l="0" t="0" r="2540" b="0"/>
+            <wp:docPr id="1257475428" name="Picture 22"/>
+            <wp:cNvGraphicFramePr>
+              <a:graphicFrameLocks xmlns:a="http://schemas.openxmlformats.org/drawingml/2006/main" noChangeAspect="1"/>
+            </wp:cNvGraphicFramePr>
+            <a:graphic xmlns:a="http://schemas.openxmlformats.org/drawingml/2006/main">
+              <a:graphicData uri="http://schemas.openxmlformats.org/drawingml/2006/picture">
+                <pic:pic xmlns:pic="http://schemas.openxmlformats.org/drawingml/2006/picture">
+                  <pic:nvPicPr>
+                    <pic:cNvPr id="0" name="Picture 41"/>
+                    <pic:cNvPicPr>
+                      <a:picLocks noChangeAspect="1" noChangeArrowheads="1"/>
+                    </pic:cNvPicPr>
+                  </pic:nvPicPr>
+                  <pic:blipFill>
+                    <a:blip r:embed="rId26" cstate="print">
+                      <a:extLst>
+                        <a:ext uri="{28A0092B-C50C-407E-A947-70E740481C1C}">
+                          <a14:useLocalDpi xmlns:a14="http://schemas.microsoft.com/office/drawing/2010/main" val="0"/>
+                        </a:ext>
+                      </a:extLst>
+                    </a:blip>
+                    <a:srcRect/>
+                    <a:stretch>
+                      <a:fillRect/>
+                    </a:stretch>
+                  </pic:blipFill>
+                  <pic:spPr bwMode="auto">
+                    <a:xfrm>
+                      <a:off x="0" y="0"/>
+                      <a:ext cx="4042276" cy="6467642"/>
+                    </a:xfrm>
+                    <a:prstGeom prst="rect">
+                      <a:avLst/>
+                    </a:prstGeom>
+                    <a:noFill/>
+                    <a:ln>
+                      <a:noFill/>
+                    </a:ln>
+                  </pic:spPr>
+                </pic:pic>
+              </a:graphicData>
+            </a:graphic>
+          </wp:inline>
+        </w:drawing>
+      </w:r>
+      <w:r>
+        <w:rPr>
+          <w:rFonts w:ascii="Verdana" w:hAnsi="Verdana"/>
+          <w:noProof/>
+        </w:rPr>
+        <w:drawing>
+          <wp:inline distT="0" distB="0" distL="0" distR="0" wp14:anchorId="1702E4DE" wp14:editId="598F9025">
+            <wp:extent cx="3988594" cy="6381750"/>
+            <wp:effectExtent l="0" t="0" r="0" b="0"/>
+            <wp:docPr id="1624794837" name="Picture 21"/>
+            <wp:cNvGraphicFramePr>
+              <a:graphicFrameLocks xmlns:a="http://schemas.openxmlformats.org/drawingml/2006/main" noChangeAspect="1"/>
+            </wp:cNvGraphicFramePr>
+            <a:graphic xmlns:a="http://schemas.openxmlformats.org/drawingml/2006/main">
+              <a:graphicData uri="http://schemas.openxmlformats.org/drawingml/2006/picture">
+                <pic:pic xmlns:pic="http://schemas.openxmlformats.org/drawingml/2006/picture">
+                  <pic:nvPicPr>
+                    <pic:cNvPr id="0" name="Picture 39"/>
+                    <pic:cNvPicPr>
+                      <a:picLocks noChangeAspect="1" noChangeArrowheads="1"/>
+                    </pic:cNvPicPr>
+                  </pic:nvPicPr>
+                  <pic:blipFill>
+                    <a:blip r:embed="rId27" cstate="print">
+                      <a:extLst>
+                        <a:ext uri="{28A0092B-C50C-407E-A947-70E740481C1C}">
+                          <a14:useLocalDpi xmlns:a14="http://schemas.microsoft.com/office/drawing/2010/main" val="0"/>
+                        </a:ext>
+                      </a:extLst>
+                    </a:blip>
+                    <a:srcRect/>
+                    <a:stretch>
+                      <a:fillRect/>
+                    </a:stretch>
+                  </pic:blipFill>
+                  <pic:spPr bwMode="auto">
+                    <a:xfrm>
+                      <a:off x="0" y="0"/>
+                      <a:ext cx="4002381" cy="6403808"/>
+                    </a:xfrm>
+                    <a:prstGeom prst="rect">
+                      <a:avLst/>
+                    </a:prstGeom>
+                    <a:noFill/>
+                    <a:ln>
+                      <a:noFill/>
+                    </a:ln>
+                  </pic:spPr>
+                </pic:pic>
+              </a:graphicData>
+            </a:graphic>
+          </wp:inline>
+        </w:drawing>
+      </w:r>
     </w:p>
     <w:p>
       <w:pPr>
@@ -2361,12 +2579,11 @@
         </w:rPr>
       </w:pPr>
       <w:bookmarkStart w:id="12" w:name="_Toc223550823"/>
-      <w:bookmarkStart w:id="13" w:name="_Toc223632445"/>
-      <w:r>
-        <w:rPr>
-          <w:rFonts w:ascii="Verdana" w:hAnsi="Verdana"/>
-        </w:rPr>
-        <w:lastRenderedPageBreak/>
+      <w:bookmarkStart w:id="13" w:name="_Toc223636906"/>
+      <w:r>
+        <w:rPr>
+          <w:rFonts w:ascii="Verdana" w:hAnsi="Verdana"/>
+        </w:rPr>
         <w:t>How it works.</w:t>
       </w:r>
       <w:bookmarkEnd w:id="12"/>
@@ -2622,12 +2839,11 @@
       </w:r>
       <w:bookmarkStart w:id="14" w:name="_Toc78485146"/>
       <w:bookmarkStart w:id="15" w:name="_Toc223550824"/>
-      <w:bookmarkStart w:id="16" w:name="_Toc223632446"/>
-      <w:r>
-        <w:rPr>
-          <w:rFonts w:ascii="Verdana" w:hAnsi="Verdana"/>
-        </w:rPr>
-        <w:lastRenderedPageBreak/>
+      <w:bookmarkStart w:id="16" w:name="_Toc223636907"/>
+      <w:r>
+        <w:rPr>
+          <w:rFonts w:ascii="Verdana" w:hAnsi="Verdana"/>
+        </w:rPr>
         <w:t>How to use it.</w:t>
       </w:r>
       <w:bookmarkEnd w:id="14"/>
@@ -2691,13 +2907,12 @@
         <w:br w:type="page"/>
       </w:r>
       <w:bookmarkStart w:id="17" w:name="_Toc223550825"/>
-      <w:bookmarkStart w:id="18" w:name="_Toc223632447"/>
+      <w:bookmarkStart w:id="18" w:name="_Toc223636908"/>
       <w:r>
         <w:rPr>
           <w:rFonts w:ascii="Verdana" w:hAnsi="Verdana"/>
           <w:lang w:val="en-DK"/>
         </w:rPr>
-        <w:lastRenderedPageBreak/>
         <w:t>File</w:t>
       </w:r>
       <w:bookmarkEnd w:id="17"/>
@@ -2735,7 +2950,7 @@
         </w:rPr>
       </w:pPr>
       <w:bookmarkStart w:id="19" w:name="_Toc223550826"/>
-      <w:bookmarkStart w:id="20" w:name="_Toc223632448"/>
+      <w:bookmarkStart w:id="20" w:name="_Toc223636909"/>
       <w:r>
         <w:rPr>
           <w:rFonts w:ascii="Verdana" w:hAnsi="Verdana"/>
@@ -2778,7 +2993,7 @@
         </w:rPr>
       </w:pPr>
       <w:bookmarkStart w:id="21" w:name="_Toc223550827"/>
-      <w:bookmarkStart w:id="22" w:name="_Toc223632449"/>
+      <w:bookmarkStart w:id="22" w:name="_Toc223636910"/>
       <w:r>
         <w:rPr>
           <w:rFonts w:ascii="Verdana" w:hAnsi="Verdana"/>
@@ -2821,7 +3036,7 @@
         </w:rPr>
       </w:pPr>
       <w:bookmarkStart w:id="23" w:name="_Toc223550828"/>
-      <w:bookmarkStart w:id="24" w:name="_Toc223632450"/>
+      <w:bookmarkStart w:id="24" w:name="_Toc223636911"/>
       <w:r>
         <w:rPr>
           <w:rFonts w:ascii="Verdana" w:hAnsi="Verdana"/>
@@ -2857,18 +3072,123 @@
     </w:p>
     <w:p>
       <w:pPr>
-        <w:rPr>
-          <w:rFonts w:ascii="Verdana" w:hAnsi="Verdana"/>
-          <w:lang w:val="en-DK"/>
-        </w:rPr>
-      </w:pPr>
-      <w:r>
+        <w:pStyle w:val="Heading1"/>
         <w:rPr>
           <w:rFonts w:ascii="Verdana" w:hAnsi="Verdana"/>
           <w:lang w:val="en-GB"/>
         </w:rPr>
+      </w:pPr>
+      <w:r>
+        <w:rPr>
+          <w:rFonts w:ascii="Verdana" w:hAnsi="Verdana"/>
+          <w:lang w:val="en-GB"/>
+        </w:rPr>
         <w:br w:type="page"/>
       </w:r>
+      <w:bookmarkStart w:id="25" w:name="_Toc223636912"/>
+      <w:r>
+        <w:rPr>
+          <w:rFonts w:ascii="Verdana" w:hAnsi="Verdana"/>
+          <w:lang w:val="en-GB"/>
+        </w:rPr>
+        <w:t>Settings (Not on phones)</w:t>
+      </w:r>
+      <w:bookmarkEnd w:id="25"/>
+    </w:p>
+    <w:p>
+      <w:pPr>
+        <w:pStyle w:val="Heading2"/>
+        <w:rPr>
+          <w:lang w:val="en-GB"/>
+        </w:rPr>
+      </w:pPr>
+      <w:bookmarkStart w:id="26" w:name="_Toc223636913"/>
+      <w:r>
+        <w:rPr>
+          <w:lang w:val="en-GB"/>
+        </w:rPr>
+        <w:t xml:space="preserve">Zoom to </w:t>
+      </w:r>
+      <w:r>
+        <w:rPr>
+          <w:lang w:val="en-GB"/>
+        </w:rPr>
+        <w:t>window.</w:t>
+      </w:r>
+      <w:bookmarkEnd w:id="26"/>
+    </w:p>
+    <w:p>
+      <w:pPr>
+        <w:rPr>
+          <w:rFonts w:ascii="Verdana" w:hAnsi="Verdana"/>
+          <w:lang w:val="en-GB"/>
+        </w:rPr>
+      </w:pPr>
+      <w:r>
+        <w:rPr>
+          <w:rFonts w:ascii="Verdana" w:hAnsi="Verdana"/>
+          <w:lang w:val="en-GB"/>
+        </w:rPr>
+        <w:t>If o</w:t>
+      </w:r>
+      <w:r>
+        <w:rPr>
+          <w:rFonts w:ascii="Verdana" w:hAnsi="Verdana"/>
+          <w:lang w:val="en-GB"/>
+        </w:rPr>
+        <w:t>n</w:t>
+      </w:r>
+      <w:r>
+        <w:rPr>
+          <w:rFonts w:ascii="Verdana" w:hAnsi="Verdana"/>
+          <w:lang w:val="en-GB"/>
+        </w:rPr>
+        <w:t>,</w:t>
+      </w:r>
+      <w:r>
+        <w:rPr>
+          <w:rFonts w:ascii="Verdana" w:hAnsi="Verdana"/>
+          <w:lang w:val="en-GB"/>
+        </w:rPr>
+        <w:t xml:space="preserve"> </w:t>
+      </w:r>
+      <w:r>
+        <w:rPr>
+          <w:rFonts w:ascii="Verdana" w:hAnsi="Verdana"/>
+          <w:lang w:val="en-GB"/>
+        </w:rPr>
+        <w:t>t</w:t>
+      </w:r>
+      <w:r>
+        <w:rPr>
+          <w:rFonts w:ascii="Verdana" w:hAnsi="Verdana"/>
+          <w:lang w:val="en-GB"/>
+        </w:rPr>
+        <w:t>he pages are automatically zoomed to window size.</w:t>
+      </w:r>
+    </w:p>
+    <w:p>
+      <w:pPr>
+        <w:rPr>
+          <w:rFonts w:ascii="Verdana" w:hAnsi="Verdana"/>
+          <w:lang w:val="en-GB"/>
+        </w:rPr>
+      </w:pPr>
+      <w:r>
+        <w:rPr>
+          <w:rFonts w:ascii="Verdana" w:hAnsi="Verdana"/>
+          <w:lang w:val="en-GB"/>
+        </w:rPr>
+        <w:br w:type="page"/>
+      </w:r>
+    </w:p>
+    <w:p>
+      <w:pPr>
+        <w:rPr>
+          <w:rFonts w:ascii="Verdana" w:hAnsi="Verdana"/>
+          <w:lang w:val="en-GB"/>
+        </w:rPr>
+      </w:pPr>
     </w:p>
     <w:p>
       <w:pPr>
@@ -2877,17 +3197,16 @@
           <w:rFonts w:ascii="Verdana" w:hAnsi="Verdana"/>
         </w:rPr>
       </w:pPr>
-      <w:bookmarkStart w:id="25" w:name="_Toc223550829"/>
-      <w:bookmarkStart w:id="26" w:name="_Toc223632451"/>
-      <w:r>
-        <w:rPr>
-          <w:rFonts w:ascii="Verdana" w:hAnsi="Verdana"/>
-        </w:rPr>
-        <w:lastRenderedPageBreak/>
+      <w:bookmarkStart w:id="27" w:name="_Toc223550829"/>
+      <w:bookmarkStart w:id="28" w:name="_Toc223636914"/>
+      <w:r>
+        <w:rPr>
+          <w:rFonts w:ascii="Verdana" w:hAnsi="Verdana"/>
+        </w:rPr>
         <w:t>Have a good time!</w:t>
       </w:r>
-      <w:bookmarkEnd w:id="25"/>
-      <w:bookmarkEnd w:id="26"/>
+      <w:bookmarkEnd w:id="27"/>
+      <w:bookmarkEnd w:id="28"/>
     </w:p>
     <w:p>
       <w:pPr>
@@ -2930,7 +3249,7 @@
       </w:pPr>
     </w:p>
     <w:sectPr>
-      <w:headerReference w:type="default" r:id="rId23"/>
+      <w:headerReference w:type="default" r:id="rId28"/>
       <w:pgSz w:w="12240" w:h="15840"/>
       <w:pgMar w:top="720" w:right="720" w:bottom="720" w:left="720" w:header="340" w:footer="720" w:gutter="0"/>
       <w:cols w:space="720"/>
@@ -4760,6 +5079,26 @@
 </a:theme>
 </file>
 
+<file path=word/webextensions/taskpanes.xml><?xml version="1.0" encoding="utf-8"?>
+<wetp:taskpanes xmlns:wetp="http://schemas.microsoft.com/office/webextensions/taskpanes/2010/11">
+  <wetp:taskpane dockstate="right" visibility="0" width="350" row="4">
+    <wetp:webextensionref xmlns:r="http://schemas.openxmlformats.org/officeDocument/2006/relationships" r:id="rId1"/>
+  </wetp:taskpane>
+</wetp:taskpanes>
+</file>
+
+<file path=word/webextensions/webextension1.xml><?xml version="1.0" encoding="utf-8"?>
+<we:webextension xmlns:we="http://schemas.microsoft.com/office/webextensions/webextension/2010/11" id="{4123A8CE-E46D-460B-B6EB-7A2D326DAEC7}">
+  <we:reference id="wa200002866" version="1.0.1.0" store="en-US" storeType="OMEX"/>
+  <we:alternateReferences>
+    <we:reference id="wa200002866" version="1.0.1.0" store="WA200002866" storeType="OMEX"/>
+  </we:alternateReferences>
+  <we:properties/>
+  <we:bindings/>
+  <we:snapshot xmlns:r="http://schemas.openxmlformats.org/officeDocument/2006/relationships"/>
+</we:webextension>
+</file>
+
 <file path=customXml/item1.xml><?xml version="1.0" encoding="utf-8"?>
 <b:Sources xmlns:b="http://schemas.openxmlformats.org/officeDocument/2006/bibliography" xmlns="http://schemas.openxmlformats.org/officeDocument/2006/bibliography" SelectedStyle="\APASixthEditionOfficeOnline.xsl" StyleName="APA" Version="6"/>
 </file>

</xml_diff>